<commit_message>
docs(draft): update IIS2 project draft
Revisions to the written draft accompanying the post-review Net3 experiments.

Co-authored-by: Cursor <cursoragent@cursor.com>
</commit_message>
<xml_diff>
--- a/meetings/我/Ruixin_Peng_Draft_Project_IIS2.docx
+++ b/meetings/我/Ruixin_Peng_Draft_Project_IIS2.docx
@@ -51,7 +51,15 @@
     </w:p>
     <w:p>
       <w:r>
-        <w:t>Maintaining an adequate free chlorine residual is essential for safeguarding water quality in drinking water distribution networks. However, chlorine decay is difficult to characterise because it is influenced by hydraulic residence time, bulk-water reactions, pipe-wall reactions and uncertainty in chlorine observations. This study develops an uncertainty-aware calibration workflow for chlorine wall-reaction modelling using the Net3 benchmark water distribution network as a controlled synthetic case study.</w:t>
+        <w:t xml:space="preserve">Maintaining an adequate free chlorine residual is essential for safeguarding water quality in drinking water distribution networks. However, chlorine decay is difficult to </w:t>
+      </w:r>
+      <w:proofErr w:type="spellStart"/>
+      <w:r>
+        <w:t>characterise</w:t>
+      </w:r>
+      <w:proofErr w:type="spellEnd"/>
+      <w:r>
+        <w:t xml:space="preserve"> because it is influenced by hydraulic residence time, bulk-water reactions, pipe-wall reactions and uncertainty in chlorine observations. This study develops an uncertainty-aware calibration workflow for chlorine wall-reaction modelling using the Net3 benchmark water distribution network as a controlled synthetic case study.</w:t>
       </w:r>
     </w:p>
     <w:p/>
@@ -63,7 +71,23 @@
     <w:p/>
     <w:p>
       <w:r>
-        <w:t>A deterministic grid-search calibration is first used as a diagnostic recovery check. The main uncertainty-aware calibration is then performed using the Generalised Likelihood Uncertainty Estimation (GLUE) framework, which retains behavioural parameter sets rather than relying only on a single best-fitting parameter vector. The retained GLUE ensemble is propagated through the Net3 network to quantify chlorine prediction uncertainty and to estimate the probability that residual chlorine falls below a threshold of 0.2 mg/L.</w:t>
+        <w:t xml:space="preserve">A deterministic grid-search calibration is first used as a diagnostic recovery check. The main uncertainty-aware calibration is then performed using the </w:t>
+      </w:r>
+      <w:proofErr w:type="spellStart"/>
+      <w:r>
+        <w:t>Generalised</w:t>
+      </w:r>
+      <w:proofErr w:type="spellEnd"/>
+      <w:r>
+        <w:t xml:space="preserve"> Likelihood Uncertainty Estimation (GLUE) framework, which retains </w:t>
+      </w:r>
+      <w:proofErr w:type="spellStart"/>
+      <w:r>
+        <w:t>behavioural</w:t>
+      </w:r>
+      <w:proofErr w:type="spellEnd"/>
+      <w:r>
+        <w:t xml:space="preserve"> parameter sets rather than relying only on a single best-fitting parameter vector. The retained GLUE ensemble is propagated through the Net3 network to quantify chlorine prediction uncertainty and to estimate the probability that residual chlorine falls below a threshold of 0.2 mg/L.</w:t>
       </w:r>
     </w:p>
     <w:p/>
@@ -118,28 +142,29 @@
         <w:rPr>
           <w:rFonts w:ascii="Times New Roman Regular" w:eastAsia="宋体" w:hAnsi="Times New Roman Regular" w:cs="Times New Roman Regular"/>
         </w:rPr>
-        <w:t>Free chlorine is commonly used in drinking water distribution networks to maintain disinfection capacity after water leaves the treatment works. The remaining residual helps protect water quality during transport through pipes, storage tanks, and service reservoirs. If the residual concentration becomes too low, parts of the network may be exposed to increased microbiological risk (LeChevallier et al., 1996; WHO, 2013). For this reason, water utilities are concerned not only with average chlorine concentrations, but also with whether concentrations at critical locations remain above a required minimum threshold.</w:t>
-      </w:r>
-    </w:p>
-    <w:p>
-      <w:pPr>
+        <w:t>Free chlorine is commonly used in drinking water distribution networks to maintain disinfection capacity after water leaves the treatment works. The remaining residual helps protect water quality during transport through pipes, storage tanks, and service reservoirs. If the residual concentration becomes too low, parts of the network may be exposed to increased microbiological risk (</w:t>
+      </w:r>
+      <w:proofErr w:type="spellStart"/>
+      <w:r>
         <w:rPr>
           <w:rFonts w:ascii="Times New Roman Regular" w:eastAsia="宋体" w:hAnsi="Times New Roman Regular" w:cs="Times New Roman Regular"/>
         </w:rPr>
-      </w:pPr>
-    </w:p>
-    <w:p>
-      <w:pPr>
+        <w:t>LeChevallier</w:t>
+      </w:r>
+      <w:proofErr w:type="spellEnd"/>
+      <w:r>
         <w:rPr>
           <w:rFonts w:ascii="Times New Roman Regular" w:eastAsia="宋体" w:hAnsi="Times New Roman Regular" w:cs="Times New Roman Regular"/>
         </w:rPr>
-      </w:pPr>
-      <w:r>
+        <w:t xml:space="preserve"> et al., 1996; WHO, 2013). For this reason, water utilities are concerned not only with average chlorine concentrations, but also with whether concentrations at critical locations remain above a required minimum threshold.</w:t>
+      </w:r>
+    </w:p>
+    <w:p>
+      <w:pPr>
         <w:rPr>
           <w:rFonts w:ascii="Times New Roman Regular" w:eastAsia="宋体" w:hAnsi="Times New Roman Regular" w:cs="Times New Roman Regular"/>
         </w:rPr>
-        <w:t>Chlorine residual decreases as water travels through a distribution system. This decay is influenced by reactions in the bulk water, reactions at the pipe wall, residence time, hydraulic conditions, pipe material, and local network operation (Rossman et al., 1994; Vasconcelos et al., 1997; Hallam et al., 2002). Locations with long water age, low turnover, or unfavourable hydraulic conditions are often more likely to experience low chlorine residual. Modelling chlorine decay can therefore support the identification of high-risk areas in the network, but the reliability of such modelling depends strongly on how well the decay parameters are represented and calibrated (Rossman et al., 1994; Vasconcelos et al., 1997).</w:t>
-      </w:r>
+      </w:pPr>
     </w:p>
     <w:p>
       <w:pPr>
@@ -147,31 +172,124 @@
           <w:rFonts w:ascii="Times New Roman Regular" w:eastAsia="宋体" w:hAnsi="Times New Roman Regular" w:cs="Times New Roman Regular"/>
         </w:rPr>
       </w:pPr>
-    </w:p>
-    <w:p>
-      <w:pPr>
+      <w:r>
         <w:rPr>
           <w:rFonts w:ascii="Times New Roman Regular" w:eastAsia="宋体" w:hAnsi="Times New Roman Regular" w:cs="Times New Roman Regular"/>
         </w:rPr>
-      </w:pPr>
+        <w:t xml:space="preserve">Chlorine residual decreases as water travels through a distribution system. This decay is influenced by reactions in the bulk water, reactions at the pipe wall, residence time, hydraulic conditions, pipe material, and local network operation (Rossman et al., 1994; Vasconcelos et al., 1997; Hallam et al., 2002). Locations with long water age, low turnover, or </w:t>
+      </w:r>
+      <w:proofErr w:type="spellStart"/>
       <w:r>
         <w:rPr>
           <w:rFonts w:ascii="Times New Roman Regular" w:eastAsia="宋体" w:hAnsi="Times New Roman Regular" w:cs="Times New Roman Regular"/>
         </w:rPr>
-        <w:t xml:space="preserve">A key challenge is that chlorine decay parameters are difficult to estimate directly. The bulk decay coefficient can often be characterised under controlled conditions, for example through laboratory jar tests, because it represents the natural decay of chlorine in the water itself (Vasconcelos et al., 1997; Hallam et al., 2003). In contrast, the wall decay coefficient is more dependent on local pipe conditions, including pipe material, age, roughness, biofilm activity, and hydraulic regime (Rossman et al., 1994; Hallam et al., 2002). It is therefore harder to measure directly and often has to be inferred indirectly by comparing simulated chlorine concentrations with monitoring data (Shang </w:t>
-      </w:r>
+        <w:t>unfavourable</w:t>
+      </w:r>
+      <w:proofErr w:type="spellEnd"/>
       <w:r>
         <w:rPr>
           <w:rFonts w:ascii="Times New Roman Regular" w:eastAsia="宋体" w:hAnsi="Times New Roman Regular" w:cs="Times New Roman Regular"/>
         </w:rPr>
+        <w:t xml:space="preserve"> hydraulic conditions are often more likely to experience low chlorine residual. Modelling chlorine decay can therefore support the identification of high-risk areas in the network, but the reliability of such modelling depends strongly on how well the decay parameters are represented and calibrated (Rossman et al., 1994; Vasconcelos et al., 1997).</w:t>
+      </w:r>
+    </w:p>
+    <w:p>
+      <w:pPr>
+        <w:rPr>
+          <w:rFonts w:ascii="Times New Roman Regular" w:eastAsia="宋体" w:hAnsi="Times New Roman Regular" w:cs="Times New Roman Regular"/>
+        </w:rPr>
+      </w:pPr>
+    </w:p>
+    <w:p>
+      <w:pPr>
+        <w:rPr>
+          <w:rFonts w:ascii="Times New Roman Regular" w:eastAsia="宋体" w:hAnsi="Times New Roman Regular" w:cs="Times New Roman Regular"/>
+        </w:rPr>
+      </w:pPr>
+      <w:r>
+        <w:rPr>
+          <w:rFonts w:ascii="Times New Roman Regular" w:eastAsia="宋体" w:hAnsi="Times New Roman Regular" w:cs="Times New Roman Regular"/>
+        </w:rPr>
+        <w:t xml:space="preserve">A key challenge is that chlorine decay parameters are difficult to estimate directly. The bulk decay coefficient can often be </w:t>
+      </w:r>
+      <w:proofErr w:type="spellStart"/>
+      <w:r>
+        <w:rPr>
+          <w:rFonts w:ascii="Times New Roman Regular" w:eastAsia="宋体" w:hAnsi="Times New Roman Regular" w:cs="Times New Roman Regular"/>
+        </w:rPr>
+        <w:t>characterised</w:t>
+      </w:r>
+      <w:proofErr w:type="spellEnd"/>
+      <w:r>
+        <w:rPr>
+          <w:rFonts w:ascii="Times New Roman Regular" w:eastAsia="宋体" w:hAnsi="Times New Roman Regular" w:cs="Times New Roman Regular"/>
+        </w:rPr>
+        <w:t xml:space="preserve"> under controlled conditions, for example through laboratory jar tests, because it represents the natural decay of chlorine in the water itself (Vasconcelos et al., 1997; Hallam et al., 2003). In contrast, the wall decay coefficient is more dependent on local pipe conditions, including pipe material, age, roughness, biofilm activity, and hydraulic regime (Rossman et al., 1994; Hallam et al., 2002). It is therefore harder to measure directly and often </w:t>
+      </w:r>
+      <w:proofErr w:type="gramStart"/>
+      <w:r>
+        <w:rPr>
+          <w:rFonts w:ascii="Times New Roman Regular" w:eastAsia="宋体" w:hAnsi="Times New Roman Regular" w:cs="Times New Roman Regular"/>
+        </w:rPr>
+        <w:t>has to</w:t>
+      </w:r>
+      <w:proofErr w:type="gramEnd"/>
+      <w:r>
+        <w:rPr>
+          <w:rFonts w:ascii="Times New Roman Regular" w:eastAsia="宋体" w:hAnsi="Times New Roman Regular" w:cs="Times New Roman Regular"/>
+        </w:rPr>
+        <w:t xml:space="preserve"> be inferred indirectly by comparing simulated chlorine concentrations with monitoring data (Shang </w:t>
+      </w:r>
+      <w:r>
+        <w:rPr>
+          <w:rFonts w:ascii="Times New Roman Regular" w:eastAsia="宋体" w:hAnsi="Times New Roman Regular" w:cs="Times New Roman Regular"/>
+        </w:rPr>
         <w:lastRenderedPageBreak/>
-        <w:t>and Uber, 2007). This creates an inverse modelling problem: given hydraulic conditions and chlorine measurements at selected monitoring points, the aim is to estimate the decay parameters that allow the model to reproduce observed chlorine behaviour.</w:t>
-      </w:r>
-    </w:p>
-    <w:p/>
-    <w:p>
-      <w:r>
-        <w:t>Although chlorine decay modelling has been widely used to support water distribution system analysis, the calibration of wall decay coefficients remains challenging because these coefficients cannot normally be measured directly and may absorb inaccuracies associated with model structure and field observations (Fisher et al., 2017; Monteiro et al., 2020). Conventional calibration studies commonly estimate decay coefficients by minimising the difference between measured and simulated chlorine concentrations, often using least-squares or related optimisation methods (Nejjari et al., 2014). However, such deterministic calibration does not explicitly represent uncertainty in the monitoring observations. This limitation becomes important when online sensor data exhibit variable sensitivity and measurement qualit</w:t>
+        <w:t xml:space="preserve">and Uber, 2007). This creates an inverse modelling problem: given hydraulic conditions and chlorine measurements at selected monitoring points, the aim is to estimate the decay parameters that allow the model to reproduce observed chlorine </w:t>
+      </w:r>
+      <w:proofErr w:type="spellStart"/>
+      <w:r>
+        <w:rPr>
+          <w:rFonts w:ascii="Times New Roman Regular" w:eastAsia="宋体" w:hAnsi="Times New Roman Regular" w:cs="Times New Roman Regular"/>
+        </w:rPr>
+        <w:t>behaviour</w:t>
+      </w:r>
+      <w:proofErr w:type="spellEnd"/>
+      <w:r>
+        <w:rPr>
+          <w:rFonts w:ascii="Times New Roman Regular" w:eastAsia="宋体" w:hAnsi="Times New Roman Regular" w:cs="Times New Roman Regular"/>
+        </w:rPr>
+        <w:t>.</w:t>
+      </w:r>
+    </w:p>
+    <w:p/>
+    <w:p>
+      <w:r>
+        <w:t xml:space="preserve">Although chlorine decay modelling has been widely used to support water distribution system analysis, the calibration of wall decay coefficients remains challenging because these coefficients cannot normally be measured directly and may absorb inaccuracies associated with model structure and field observations (Fisher et al., 2017; Monteiro et al., 2020). Conventional calibration studies commonly estimate decay coefficients by </w:t>
+      </w:r>
+      <w:proofErr w:type="spellStart"/>
+      <w:r>
+        <w:t>minimising</w:t>
+      </w:r>
+      <w:proofErr w:type="spellEnd"/>
+      <w:r>
+        <w:t xml:space="preserve"> the difference between measured and simulated chlorine concentrations, often using least-squares or related </w:t>
+      </w:r>
+      <w:proofErr w:type="spellStart"/>
+      <w:r>
+        <w:t>optimisation</w:t>
+      </w:r>
+      <w:proofErr w:type="spellEnd"/>
+      <w:r>
+        <w:t xml:space="preserve"> methods (</w:t>
+      </w:r>
+      <w:proofErr w:type="spellStart"/>
+      <w:r>
+        <w:t>Nejjari</w:t>
+      </w:r>
+      <w:proofErr w:type="spellEnd"/>
+      <w:r>
+        <w:t xml:space="preserve"> et al., 2014). However, such deterministic calibration does not explicitly represent uncertainty in the monitoring observations. This limitation becomes important when online sensor data exhibit variable sensitivity and measurement qualit</w:t>
       </w:r>
       <w:r>
         <w:rPr>
@@ -197,7 +315,23 @@
         </w:rPr>
       </w:pPr>
       <w:r>
-        <w:t>This issue is particularly important when chlorine concentrations are close to the operational threshold. Online chlorine measurements may be affected by sensor sensitivity, measurement variability, calibration and maintenance conditions, and short-term changes in local water quality and hydraulic conditions (EPA, 2009; Aisopou and Stoianov, 2024). When the measured concentration is close to the threshold, even a relatively small measurement error may alter the interpretation of whether the underlying chlorine residual is above or below the required value (EPA, 2009). Calibration and threshold-risk assessment should therefore account for measurement uncertainty rather than treating observed chlorine data as exact values</w:t>
+        <w:t xml:space="preserve">This issue is particularly important when chlorine concentrations are close to the operational threshold. Online chlorine measurements may be affected by sensor sensitivity, measurement variability, calibration and maintenance conditions, and short-term changes in local water quality and hydraulic conditions (EPA, 2009; </w:t>
+      </w:r>
+      <w:proofErr w:type="spellStart"/>
+      <w:r>
+        <w:t>Aisopou</w:t>
+      </w:r>
+      <w:proofErr w:type="spellEnd"/>
+      <w:r>
+        <w:t xml:space="preserve"> and </w:t>
+      </w:r>
+      <w:proofErr w:type="spellStart"/>
+      <w:r>
+        <w:t>Stoianov</w:t>
+      </w:r>
+      <w:proofErr w:type="spellEnd"/>
+      <w:r>
+        <w:t>, 2024). When the measured concentration is close to the threshold, even a relatively small measurement error may alter the interpretation of whether the underlying chlorine residual is above or below the required value (EPA, 2009). Calibration and threshold-risk assessment should therefore account for measurement uncertainty rather than treating observed chlorine data as exact values</w:t>
       </w:r>
       <w:r>
         <w:rPr>
@@ -230,26 +364,82 @@
           <w:rFonts w:ascii="Times New Roman Regular" w:eastAsia="宋体" w:hAnsi="Times New Roman Regular" w:cs="Times New Roman Regular"/>
         </w:rPr>
         <w:lastRenderedPageBreak/>
-        <w:t>about concentration levels, but also about the temporal shape and spatial variation of chlorine residual across a network (Aisopou and Stoianov, 2024; Taha et al., 2020). In a controlled synthetic setting, such observations can be used to test whether an inverse calibration procedure can recover spatial variation in wall decay behaviour from a limited set of monitoring nodes (Wang et al., 2022; Kazma et al., 2024).</w:t>
-      </w:r>
-    </w:p>
-    <w:p>
-      <w:pPr>
+        <w:t>about concentration levels, but also about the temporal shape and spatial variation of chlorine residual across a network (</w:t>
+      </w:r>
+      <w:proofErr w:type="spellStart"/>
+      <w:r>
         <w:rPr>
           <w:rFonts w:ascii="Times New Roman Regular" w:eastAsia="宋体" w:hAnsi="Times New Roman Regular" w:cs="Times New Roman Regular"/>
         </w:rPr>
-      </w:pPr>
-    </w:p>
-    <w:p>
-      <w:pPr>
+        <w:t>Aisopou</w:t>
+      </w:r>
+      <w:proofErr w:type="spellEnd"/>
+      <w:r>
         <w:rPr>
           <w:rFonts w:ascii="Times New Roman Regular" w:eastAsia="宋体" w:hAnsi="Times New Roman Regular" w:cs="Times New Roman Regular"/>
         </w:rPr>
-      </w:pPr>
+        <w:t xml:space="preserve"> and </w:t>
+      </w:r>
+      <w:proofErr w:type="spellStart"/>
       <w:r>
         <w:rPr>
           <w:rFonts w:ascii="Times New Roman Regular" w:eastAsia="宋体" w:hAnsi="Times New Roman Regular" w:cs="Times New Roman Regular"/>
         </w:rPr>
+        <w:t>Stoianov</w:t>
+      </w:r>
+      <w:proofErr w:type="spellEnd"/>
+      <w:r>
+        <w:rPr>
+          <w:rFonts w:ascii="Times New Roman Regular" w:eastAsia="宋体" w:hAnsi="Times New Roman Regular" w:cs="Times New Roman Regular"/>
+        </w:rPr>
+        <w:t xml:space="preserve">, 2024; Taha et al., 2020). In a controlled synthetic setting, such observations can be used to test whether an inverse calibration procedure can recover spatial variation in wall decay </w:t>
+      </w:r>
+      <w:proofErr w:type="spellStart"/>
+      <w:r>
+        <w:rPr>
+          <w:rFonts w:ascii="Times New Roman Regular" w:eastAsia="宋体" w:hAnsi="Times New Roman Regular" w:cs="Times New Roman Regular"/>
+        </w:rPr>
+        <w:t>behaviour</w:t>
+      </w:r>
+      <w:proofErr w:type="spellEnd"/>
+      <w:r>
+        <w:rPr>
+          <w:rFonts w:ascii="Times New Roman Regular" w:eastAsia="宋体" w:hAnsi="Times New Roman Regular" w:cs="Times New Roman Regular"/>
+        </w:rPr>
+        <w:t xml:space="preserve"> from a limited set of monitoring nodes (Wang et al., 2022; </w:t>
+      </w:r>
+      <w:proofErr w:type="spellStart"/>
+      <w:r>
+        <w:rPr>
+          <w:rFonts w:ascii="Times New Roman Regular" w:eastAsia="宋体" w:hAnsi="Times New Roman Regular" w:cs="Times New Roman Regular"/>
+        </w:rPr>
+        <w:t>Kazma</w:t>
+      </w:r>
+      <w:proofErr w:type="spellEnd"/>
+      <w:r>
+        <w:rPr>
+          <w:rFonts w:ascii="Times New Roman Regular" w:eastAsia="宋体" w:hAnsi="Times New Roman Regular" w:cs="Times New Roman Regular"/>
+        </w:rPr>
+        <w:t xml:space="preserve"> et al., 2024).</w:t>
+      </w:r>
+    </w:p>
+    <w:p>
+      <w:pPr>
+        <w:rPr>
+          <w:rFonts w:ascii="Times New Roman Regular" w:eastAsia="宋体" w:hAnsi="Times New Roman Regular" w:cs="Times New Roman Regular"/>
+        </w:rPr>
+      </w:pPr>
+    </w:p>
+    <w:p>
+      <w:pPr>
+        <w:rPr>
+          <w:rFonts w:ascii="Times New Roman Regular" w:eastAsia="宋体" w:hAnsi="Times New Roman Regular" w:cs="Times New Roman Regular"/>
+        </w:rPr>
+      </w:pPr>
+      <w:r>
+        <w:rPr>
+          <w:rFonts w:ascii="Times New Roman Regular" w:eastAsia="宋体" w:hAnsi="Times New Roman Regular" w:cs="Times New Roman Regular"/>
+        </w:rPr>
         <w:t>The aim of this study is to develop and test an uncertainty-aware calibration workflow for estimating spatially varying chlorine wall reaction coefficients in the Net3 benchmark water distribution network. The study uses synthetic chlorine observations generated from known grouped wall reaction coefficients, allowing the inverse calibration procedure and uncertainty propagation workflow to be evaluated under controlled conditions.</w:t>
       </w:r>
     </w:p>
@@ -283,34 +473,37 @@
         <w:rPr>
           <w:rFonts w:ascii="Times New Roman Regular" w:eastAsia="宋体" w:hAnsi="Times New Roman Regular" w:cs="Times New Roman Regular"/>
         </w:rPr>
-        <w:t>1. implement a WNTR/EPANET chlorine transport model for the Net3 benchmark network;</w:t>
-      </w:r>
-    </w:p>
-    <w:p>
-      <w:pPr>
+        <w:t xml:space="preserve">1. implement a WNTR/EPANET chlorine transport model for the Net3 benchmark </w:t>
+      </w:r>
+      <w:proofErr w:type="gramStart"/>
+      <w:r>
         <w:rPr>
           <w:rFonts w:ascii="Times New Roman Regular" w:eastAsia="宋体" w:hAnsi="Times New Roman Regular" w:cs="Times New Roman Regular"/>
         </w:rPr>
-      </w:pPr>
-      <w:r>
+        <w:t>network;</w:t>
+      </w:r>
+      <w:proofErr w:type="gramEnd"/>
+    </w:p>
+    <w:p>
+      <w:pPr>
         <w:rPr>
           <w:rFonts w:ascii="Times New Roman Regular" w:eastAsia="宋体" w:hAnsi="Times New Roman Regular" w:cs="Times New Roman Regular"/>
         </w:rPr>
-        <w:t>2. construct a controlled synthetic wall-decay field using grouped pipe-wall reaction coefficients;</w:t>
-      </w:r>
-    </w:p>
-    <w:p>
-      <w:pPr>
+      </w:pPr>
+      <w:r>
         <w:rPr>
           <w:rFonts w:ascii="Times New Roman Regular" w:eastAsia="宋体" w:hAnsi="Times New Roman Regular" w:cs="Times New Roman Regular"/>
         </w:rPr>
-      </w:pPr>
+        <w:t xml:space="preserve">2. construct a controlled synthetic wall-decay field using grouped pipe-wall reaction </w:t>
+      </w:r>
+      <w:proofErr w:type="gramStart"/>
       <w:r>
         <w:rPr>
           <w:rFonts w:ascii="Times New Roman Regular" w:eastAsia="宋体" w:hAnsi="Times New Roman Regular" w:cs="Times New Roman Regular"/>
         </w:rPr>
-        <w:t>3. generate noisy synthetic chlorine observations at selected monitoring nodes;</w:t>
-      </w:r>
+        <w:t>coefficients;</w:t>
+      </w:r>
+      <w:proofErr w:type="gramEnd"/>
     </w:p>
     <w:p>
       <w:pPr>
@@ -322,21 +515,58 @@
         <w:rPr>
           <w:rFonts w:ascii="Times New Roman Regular" w:eastAsia="宋体" w:hAnsi="Times New Roman Regular" w:cs="Times New Roman Regular"/>
         </w:rPr>
-        <w:t>4. formulate grouped wall-decay estimation as an inverse calibration problem;</w:t>
-      </w:r>
-    </w:p>
-    <w:p>
-      <w:pPr>
+        <w:t xml:space="preserve">3. generate noisy synthetic chlorine observations at selected monitoring </w:t>
+      </w:r>
+      <w:proofErr w:type="gramStart"/>
+      <w:r>
         <w:rPr>
           <w:rFonts w:ascii="Times New Roman Regular" w:eastAsia="宋体" w:hAnsi="Times New Roman Regular" w:cs="Times New Roman Regular"/>
         </w:rPr>
-      </w:pPr>
-      <w:r>
+        <w:t>nodes;</w:t>
+      </w:r>
+      <w:proofErr w:type="gramEnd"/>
+    </w:p>
+    <w:p>
+      <w:pPr>
         <w:rPr>
           <w:rFonts w:ascii="Times New Roman Regular" w:eastAsia="宋体" w:hAnsi="Times New Roman Regular" w:cs="Times New Roman Regular"/>
         </w:rPr>
-        <w:t>5. compare deterministic grid-search recovery with GLUE-based uncertainty-aware calibration;</w:t>
-      </w:r>
+      </w:pPr>
+      <w:r>
+        <w:rPr>
+          <w:rFonts w:ascii="Times New Roman Regular" w:eastAsia="宋体" w:hAnsi="Times New Roman Regular" w:cs="Times New Roman Regular"/>
+        </w:rPr>
+        <w:t xml:space="preserve">4. formulate grouped wall-decay estimation as an inverse calibration </w:t>
+      </w:r>
+      <w:proofErr w:type="gramStart"/>
+      <w:r>
+        <w:rPr>
+          <w:rFonts w:ascii="Times New Roman Regular" w:eastAsia="宋体" w:hAnsi="Times New Roman Regular" w:cs="Times New Roman Regular"/>
+        </w:rPr>
+        <w:t>problem;</w:t>
+      </w:r>
+      <w:proofErr w:type="gramEnd"/>
+    </w:p>
+    <w:p>
+      <w:pPr>
+        <w:rPr>
+          <w:rFonts w:ascii="Times New Roman Regular" w:eastAsia="宋体" w:hAnsi="Times New Roman Regular" w:cs="Times New Roman Regular"/>
+        </w:rPr>
+      </w:pPr>
+      <w:r>
+        <w:rPr>
+          <w:rFonts w:ascii="Times New Roman Regular" w:eastAsia="宋体" w:hAnsi="Times New Roman Regular" w:cs="Times New Roman Regular"/>
+        </w:rPr>
+        <w:t xml:space="preserve">5. compare deterministic grid-search recovery with GLUE-based uncertainty-aware </w:t>
+      </w:r>
+      <w:proofErr w:type="gramStart"/>
+      <w:r>
+        <w:rPr>
+          <w:rFonts w:ascii="Times New Roman Regular" w:eastAsia="宋体" w:hAnsi="Times New Roman Regular" w:cs="Times New Roman Regular"/>
+        </w:rPr>
+        <w:t>calibration;</w:t>
+      </w:r>
+      <w:proofErr w:type="gramEnd"/>
     </w:p>
     <w:p>
       <w:pPr>
@@ -444,26 +674,40 @@
         <w:rPr>
           <w:rFonts w:ascii="Times New Roman Regular" w:hAnsi="Times New Roman Regular" w:cs="Times New Roman Regular"/>
         </w:rPr>
-        <w:t>Free chlorine residual is maintained in drinking water distribution networks to provide continuing disinfection after treated water enters the pipe system. Although primary disinfection occurs at the treatment works, a residual disinfectant is needed because water may remain in the distribution network for many hours or days before reaching consumers. During this time, the residual helps limit microbial regrowth and provides an operational indicator of water quality protection. Low disinfectant residuals have been associated with increased risk of microbial regrowth in distribution systems, particularly in areas with poor turnover or long residence time (LeChevallier et al., 1996; WHO, 2013).</w:t>
-      </w:r>
-    </w:p>
-    <w:p>
-      <w:pPr>
+        <w:t>Free chlorine residual is maintained in drinking water distribution networks to provide continuing disinfection after treated water enters the pipe system. Although primary disinfection occurs at the treatment works, a residual disinfectant is needed because water may remain in the distribution network for many hours or days before reaching consumers. During this time, the residual helps limit microbial regrowth and provides an operational indicator of water quality protection. Low disinfectant residuals have been associated with increased risk of microbial regrowth in distribution systems, particularly in areas with poor turnover or long residence time (</w:t>
+      </w:r>
+      <w:proofErr w:type="spellStart"/>
+      <w:r>
         <w:rPr>
           <w:rFonts w:ascii="Times New Roman Regular" w:hAnsi="Times New Roman Regular" w:cs="Times New Roman Regular"/>
         </w:rPr>
-      </w:pPr>
-    </w:p>
-    <w:p>
-      <w:pPr>
+        <w:t>LeChevallier</w:t>
+      </w:r>
+      <w:proofErr w:type="spellEnd"/>
+      <w:r>
         <w:rPr>
           <w:rFonts w:ascii="Times New Roman Regular" w:hAnsi="Times New Roman Regular" w:cs="Times New Roman Regular"/>
         </w:rPr>
-      </w:pPr>
-      <w:r>
+        <w:t xml:space="preserve"> et al., 1996; WHO, 2013).</w:t>
+      </w:r>
+    </w:p>
+    <w:p>
+      <w:pPr>
         <w:rPr>
           <w:rFonts w:ascii="Times New Roman Regular" w:hAnsi="Times New Roman Regular" w:cs="Times New Roman Regular"/>
         </w:rPr>
+      </w:pPr>
+    </w:p>
+    <w:p>
+      <w:pPr>
+        <w:rPr>
+          <w:rFonts w:ascii="Times New Roman Regular" w:hAnsi="Times New Roman Regular" w:cs="Times New Roman Regular"/>
+        </w:rPr>
+      </w:pPr>
+      <w:r>
+        <w:rPr>
+          <w:rFonts w:ascii="Times New Roman Regular" w:hAnsi="Times New Roman Regular" w:cs="Times New Roman Regular"/>
+        </w:rPr>
         <w:t xml:space="preserve">Chlorine residual is not conservative. Its concentration decreases as water is transported through pipes, storage tanks, and service reservoirs. This decay is commonly described through two main processes: bulk decay and wall decay. Bulk decay refers to reactions </w:t>
       </w:r>
       <w:r>
@@ -471,26 +715,54 @@
           <w:rFonts w:ascii="Times New Roman Regular" w:hAnsi="Times New Roman Regular" w:cs="Times New Roman Regular"/>
         </w:rPr>
         <w:lastRenderedPageBreak/>
-        <w:t>occurring within the water itself, for example reactions between chlorine and natural organic matter, ammonia, reduced compounds, or other reactive substances present in treated water. This component depends on water chemistry, temperature, pH, and initial chlorine concentration. Because bulk decay represents the behaviour of the water under controlled conditions, it can often be characterised through laboratory bottle or jar tests (Vasconcelos et al., 1997).</w:t>
-      </w:r>
-    </w:p>
-    <w:p>
-      <w:pPr>
+        <w:t xml:space="preserve">occurring within the water itself, for example reactions between chlorine and natural organic matter, ammonia, reduced compounds, or other reactive substances present in treated water. This component depends on water chemistry, temperature, pH, and initial chlorine concentration. Because bulk decay represents the </w:t>
+      </w:r>
+      <w:proofErr w:type="spellStart"/>
+      <w:r>
         <w:rPr>
           <w:rFonts w:ascii="Times New Roman Regular" w:hAnsi="Times New Roman Regular" w:cs="Times New Roman Regular"/>
         </w:rPr>
-      </w:pPr>
-    </w:p>
-    <w:p>
-      <w:pPr>
+        <w:t>behaviour</w:t>
+      </w:r>
+      <w:proofErr w:type="spellEnd"/>
+      <w:r>
         <w:rPr>
           <w:rFonts w:ascii="Times New Roman Regular" w:hAnsi="Times New Roman Regular" w:cs="Times New Roman Regular"/>
         </w:rPr>
-      </w:pPr>
+        <w:t xml:space="preserve"> of the water under controlled conditions, it can often be </w:t>
+      </w:r>
+      <w:proofErr w:type="spellStart"/>
       <w:r>
         <w:rPr>
           <w:rFonts w:ascii="Times New Roman Regular" w:hAnsi="Times New Roman Regular" w:cs="Times New Roman Regular"/>
         </w:rPr>
+        <w:t>characterised</w:t>
+      </w:r>
+      <w:proofErr w:type="spellEnd"/>
+      <w:r>
+        <w:rPr>
+          <w:rFonts w:ascii="Times New Roman Regular" w:hAnsi="Times New Roman Regular" w:cs="Times New Roman Regular"/>
+        </w:rPr>
+        <w:t xml:space="preserve"> through laboratory bottle or jar tests (Vasconcelos et al., 1997).</w:t>
+      </w:r>
+    </w:p>
+    <w:p>
+      <w:pPr>
+        <w:rPr>
+          <w:rFonts w:ascii="Times New Roman Regular" w:hAnsi="Times New Roman Regular" w:cs="Times New Roman Regular"/>
+        </w:rPr>
+      </w:pPr>
+    </w:p>
+    <w:p>
+      <w:pPr>
+        <w:rPr>
+          <w:rFonts w:ascii="Times New Roman Regular" w:hAnsi="Times New Roman Regular" w:cs="Times New Roman Regular"/>
+        </w:rPr>
+      </w:pPr>
+      <w:r>
+        <w:rPr>
+          <w:rFonts w:ascii="Times New Roman Regular" w:hAnsi="Times New Roman Regular" w:cs="Times New Roman Regular"/>
+        </w:rPr>
         <w:t>Wall decay refers to chlorine consumption at or near the pipe wall. This can include reactions with pipe material, corrosion products, deposits, biofilms, and substances attached to the internal pipe surface. Unlike bulk decay, wall decay is strongly influenced by local pipe characteristics and hydraulic conditions. Pipe material, age, roughness, diameter, biofilm activity, and corrosion state can all affect the rate at which chlorine is consumed at the wall. For this reason, the wall decay coefficient is generally more spatially variable and more difficult to measure directly than the bulk decay coefficient (Rossman et al., 1994; Vasconcelos et al., 1997).</w:t>
       </w:r>
     </w:p>
@@ -511,7 +783,21 @@
         <w:rPr>
           <w:rFonts w:ascii="Times New Roman Regular" w:hAnsi="Times New Roman Regular" w:cs="Times New Roman Regular"/>
         </w:rPr>
-        <w:t>Hydraulic behaviour also has a strong influence on chlorine residual. Water age is particularly important because it represents the time available for chlorine reactions to occur, and EPANET explicitly includes water age and reactive water-quality transport as part of distribution network simulation (Rossman, 2000; Rossman et al., 1994). Areas with long residence time, low demand, storage effects, or poor turnover are therefore more likely to experience lower residual concentrations. Flow velocity can also affect chlorine decay by changing both residence time and mass transfer between the bulk water and the pipe wall (Rossman et al., 1994; Rossman, 2000). Pipe diameter is relevant because smaller pipes have a larger wall surface area relative to the volume of water, which can increase the relative importance of wall reactions. As a result, chlorine residual patterns are shaped by the interaction between reaction kinetics and the hydraulic structure of the network (Rossman et al., 1994; Rossman and Boulos, 1996).</w:t>
+        <w:t xml:space="preserve">Hydraulic </w:t>
+      </w:r>
+      <w:proofErr w:type="spellStart"/>
+      <w:r>
+        <w:rPr>
+          <w:rFonts w:ascii="Times New Roman Regular" w:hAnsi="Times New Roman Regular" w:cs="Times New Roman Regular"/>
+        </w:rPr>
+        <w:t>behaviour</w:t>
+      </w:r>
+      <w:proofErr w:type="spellEnd"/>
+      <w:r>
+        <w:rPr>
+          <w:rFonts w:ascii="Times New Roman Regular" w:hAnsi="Times New Roman Regular" w:cs="Times New Roman Regular"/>
+        </w:rPr>
+        <w:t xml:space="preserve"> also has a strong influence on chlorine residual. Water age is particularly important because it represents the time available for chlorine reactions to occur, and EPANET explicitly includes water age and reactive water-quality transport as part of distribution network simulation (Rossman, 2000; Rossman et al., 1994). Areas with long residence time, low demand, storage effects, or poor turnover are therefore more likely to experience lower residual concentrations. Flow velocity can also affect chlorine decay by changing both residence time and mass transfer between the bulk water and the pipe wall (Rossman et al., 1994; Rossman, 2000). Pipe diameter is relevant because smaller pipes have a larger wall surface area relative to the volume of water, which can increase the relative importance of wall reactions. As a result, chlorine residual patterns are shaped by the interaction between reaction kinetics and the hydraulic structure of the network (Rossman et al., 1994; Rossman and Boulos, 1996).</w:t>
       </w:r>
     </w:p>
     <w:p>
@@ -752,27 +1038,83 @@
         <w:rPr>
           <w:rFonts w:ascii="Times New Roman Regular" w:eastAsia="宋体" w:hAnsi="Times New Roman Regular" w:cs="Times New Roman Regular"/>
         </w:rPr>
-        <w:t>Chlorine monitoring data provide the observational basis for calibrating water quality models, but these data should not be treated as exact representations of the true chlorine concentration. Online chlorine sensors can provide high-frequency measurements and reveal short-term temporal variation that would not be captured by occasional grab samples. However, their data quality can be affected by sensor noise, calibration drift, fouling, changes in sensor sensitivity, maintenance conditions, and differences between online measurements and reference sampling methods. Additional uncertainty can also arise from missing data, outliers, time synchronisation errors between hydraulic simulations and measurements, and local hydraulic variability at the monitoring location. These issues are particularly important for free chlorine because operationally relevant concentrations may be close to the minimum residual threshold (EPA, 2009; Aisopou and Stoianov, 2024).</w:t>
-      </w:r>
-    </w:p>
-    <w:p>
-      <w:pPr>
+        <w:t xml:space="preserve">Chlorine monitoring data provide the observational basis for calibrating water quality models, but these data should not be treated as exact representations of the true chlorine concentration. Online chlorine sensors can provide high-frequency measurements and reveal short-term temporal variation that would not be captured by occasional grab samples. However, their data quality can be affected by sensor noise, calibration drift, fouling, changes in sensor sensitivity, maintenance conditions, and differences between online measurements and reference sampling methods. Additional uncertainty can also arise from missing data, outliers, time </w:t>
+      </w:r>
+      <w:proofErr w:type="spellStart"/>
+      <w:r>
         <w:rPr>
           <w:rFonts w:ascii="Times New Roman Regular" w:eastAsia="宋体" w:hAnsi="Times New Roman Regular" w:cs="Times New Roman Regular"/>
         </w:rPr>
-      </w:pPr>
-    </w:p>
-    <w:p>
-      <w:pPr>
+        <w:t>synchronisation</w:t>
+      </w:r>
+      <w:proofErr w:type="spellEnd"/>
+      <w:r>
         <w:rPr>
           <w:rFonts w:ascii="Times New Roman Regular" w:eastAsia="宋体" w:hAnsi="Times New Roman Regular" w:cs="Times New Roman Regular"/>
         </w:rPr>
-      </w:pPr>
+        <w:t xml:space="preserve"> errors between hydraulic simulations and measurements, and local hydraulic variability at the monitoring location. These issues are particularly important for free chlorine because operationally relevant concentrations may be close to the minimum residual threshold (EPA, 2009; </w:t>
+      </w:r>
+      <w:proofErr w:type="spellStart"/>
       <w:r>
         <w:rPr>
           <w:rFonts w:ascii="Times New Roman Regular" w:eastAsia="宋体" w:hAnsi="Times New Roman Regular" w:cs="Times New Roman Regular"/>
         </w:rPr>
-        <w:t>Measurement uncertainty directly affects parameter estimation because calibration is based on the difference between observed and simulated model outputs. If monitoring data contain noise or bias, a calibration procedure may adjust model parameters to compensate for measurement error rather than true physical behaviour. Because wall decay coefficients are inferred indirectly from chlorine observations, uncertainty in the observations can propagate into uncertainty in the estimated coefficients. This means that a calibrated wall decay coefficient should not be interpreted independently of the quality and uncertainty of the monitoring data used to estimate it.</w:t>
+        <w:t>Aisopou</w:t>
+      </w:r>
+      <w:proofErr w:type="spellEnd"/>
+      <w:r>
+        <w:rPr>
+          <w:rFonts w:ascii="Times New Roman Regular" w:eastAsia="宋体" w:hAnsi="Times New Roman Regular" w:cs="Times New Roman Regular"/>
+        </w:rPr>
+        <w:t xml:space="preserve"> and </w:t>
+      </w:r>
+      <w:proofErr w:type="spellStart"/>
+      <w:r>
+        <w:rPr>
+          <w:rFonts w:ascii="Times New Roman Regular" w:eastAsia="宋体" w:hAnsi="Times New Roman Regular" w:cs="Times New Roman Regular"/>
+        </w:rPr>
+        <w:t>Stoianov</w:t>
+      </w:r>
+      <w:proofErr w:type="spellEnd"/>
+      <w:r>
+        <w:rPr>
+          <w:rFonts w:ascii="Times New Roman Regular" w:eastAsia="宋体" w:hAnsi="Times New Roman Regular" w:cs="Times New Roman Regular"/>
+        </w:rPr>
+        <w:t>, 2024).</w:t>
+      </w:r>
+    </w:p>
+    <w:p>
+      <w:pPr>
+        <w:rPr>
+          <w:rFonts w:ascii="Times New Roman Regular" w:eastAsia="宋体" w:hAnsi="Times New Roman Regular" w:cs="Times New Roman Regular"/>
+        </w:rPr>
+      </w:pPr>
+    </w:p>
+    <w:p>
+      <w:pPr>
+        <w:rPr>
+          <w:rFonts w:ascii="Times New Roman Regular" w:eastAsia="宋体" w:hAnsi="Times New Roman Regular" w:cs="Times New Roman Regular"/>
+        </w:rPr>
+      </w:pPr>
+      <w:r>
+        <w:rPr>
+          <w:rFonts w:ascii="Times New Roman Regular" w:eastAsia="宋体" w:hAnsi="Times New Roman Regular" w:cs="Times New Roman Regular"/>
+        </w:rPr>
+        <w:t xml:space="preserve">Measurement uncertainty directly affects parameter estimation because calibration is based on the difference between observed and simulated model outputs. If monitoring data contain noise or bias, a calibration procedure may adjust model parameters to compensate for measurement error rather than true physical </w:t>
+      </w:r>
+      <w:proofErr w:type="spellStart"/>
+      <w:r>
+        <w:rPr>
+          <w:rFonts w:ascii="Times New Roman Regular" w:eastAsia="宋体" w:hAnsi="Times New Roman Regular" w:cs="Times New Roman Regular"/>
+        </w:rPr>
+        <w:t>behaviour</w:t>
+      </w:r>
+      <w:proofErr w:type="spellEnd"/>
+      <w:r>
+        <w:rPr>
+          <w:rFonts w:ascii="Times New Roman Regular" w:eastAsia="宋体" w:hAnsi="Times New Roman Regular" w:cs="Times New Roman Regular"/>
+        </w:rPr>
+        <w:t>. Because wall decay coefficients are inferred indirectly from chlorine observations, uncertainty in the observations can propagate into uncertainty in the estimated coefficients. This means that a calibrated wall decay coefficient should not be interpreted independently of the quality and uncertainty of the monitoring data used to estimate it.</w:t>
       </w:r>
     </w:p>
     <w:p>
@@ -819,28 +1161,29 @@
         <w:rPr>
           <w:rFonts w:ascii="Times New Roman Regular" w:eastAsia="宋体" w:hAnsi="Times New Roman Regular" w:cs="Times New Roman Regular"/>
         </w:rPr>
-        <w:t>A common approach to parameter calibration is residual minimisation, where the difference between measured and simulated chlorine concentrations is reduced by adjusting the model parameters (Tarantola, 2005; Aster et al., 2018). This can be implemented using unweighted or weighted least-squares objectives, likelihood-based methods, Bayesian inference, or ensemble-based approaches. When measurement uncertainty is available, observations with higher uncertainty can be assigned lower influence in the calibration process. Under assumptions of independent normally distributed measurement errors, weighted least squares is closely related to maximum likelihood estimation.</w:t>
-      </w:r>
-    </w:p>
-    <w:p>
-      <w:pPr>
+        <w:t xml:space="preserve">A common approach to parameter calibration is residual </w:t>
+      </w:r>
+      <w:proofErr w:type="spellStart"/>
+      <w:r>
         <w:rPr>
           <w:rFonts w:ascii="Times New Roman Regular" w:eastAsia="宋体" w:hAnsi="Times New Roman Regular" w:cs="Times New Roman Regular"/>
         </w:rPr>
-      </w:pPr>
-    </w:p>
-    <w:p>
-      <w:pPr>
+        <w:t>minimisation</w:t>
+      </w:r>
+      <w:proofErr w:type="spellEnd"/>
+      <w:r>
         <w:rPr>
           <w:rFonts w:ascii="Times New Roman Regular" w:eastAsia="宋体" w:hAnsi="Times New Roman Regular" w:cs="Times New Roman Regular"/>
         </w:rPr>
-      </w:pPr>
-      <w:r>
+        <w:t>, where the difference between measured and simulated chlorine concentrations is reduced by adjusting the model parameters (Tarantola, 2005; Aster et al., 2018). This can be implemented using unweighted or weighted least-squares objectives, likelihood-based methods, Bayesian inference, or ensemble-based approaches. When measurement uncertainty is available, observations with higher uncertainty can be assigned lower influence in the calibration process. Under assumptions of independent normally distributed measurement errors, weighted least squares is closely related to maximum likelihood estimation.</w:t>
+      </w:r>
+    </w:p>
+    <w:p>
+      <w:pPr>
         <w:rPr>
           <w:rFonts w:ascii="Times New Roman Regular" w:eastAsia="宋体" w:hAnsi="Times New Roman Regular" w:cs="Times New Roman Regular"/>
         </w:rPr>
-        <w:t>In water distribution networks, the inverse problem can be ill-conditioned because different combinations of wall decay coefficients may produce similar chlorine concentrations at the available monitoring points (Tarantola, 2005; Aster et al., 2018). This issue is particularly likely when monitoring locations are sparse relative to the number of pipe groups or zones being calibrated. Even with dense monitoring data, identifiability can remain challenging if the monitored locations do not provide enough information about the pipes or zones where decay parameters are being estimated, because water-quality observability depends on sensor placement and hydraulic conditions (Taha et al., 2020; Kazma et al., 2024). As a result, a single best-fitting parameter set may not fully represent the uncertainty in the calibration result.</w:t>
-      </w:r>
+      </w:pPr>
     </w:p>
     <w:p>
       <w:pPr>
@@ -848,17 +1191,44 @@
           <w:rFonts w:ascii="Times New Roman Regular" w:eastAsia="宋体" w:hAnsi="Times New Roman Regular" w:cs="Times New Roman Regular"/>
         </w:rPr>
       </w:pPr>
-    </w:p>
-    <w:p>
-      <w:pPr>
+      <w:r>
         <w:rPr>
           <w:rFonts w:ascii="Times New Roman Regular" w:eastAsia="宋体" w:hAnsi="Times New Roman Regular" w:cs="Times New Roman Regular"/>
         </w:rPr>
-      </w:pPr>
+        <w:t xml:space="preserve">In water distribution networks, the inverse problem can be ill-conditioned because different combinations of wall decay coefficients may produce similar chlorine concentrations at the available monitoring points (Tarantola, 2005; Aster et al., 2018). This issue is particularly likely when monitoring locations are sparse relative to the number of pipe groups or zones being calibrated. Even with dense monitoring data, identifiability can remain challenging if the monitored locations do not provide enough information about the pipes or zones where decay parameters are being estimated, because water-quality observability depends on sensor placement and hydraulic conditions (Taha et al., 2020; </w:t>
+      </w:r>
+      <w:proofErr w:type="spellStart"/>
       <w:r>
         <w:rPr>
           <w:rFonts w:ascii="Times New Roman Regular" w:eastAsia="宋体" w:hAnsi="Times New Roman Regular" w:cs="Times New Roman Regular"/>
         </w:rPr>
+        <w:t>Kazma</w:t>
+      </w:r>
+      <w:proofErr w:type="spellEnd"/>
+      <w:r>
+        <w:rPr>
+          <w:rFonts w:ascii="Times New Roman Regular" w:eastAsia="宋体" w:hAnsi="Times New Roman Regular" w:cs="Times New Roman Regular"/>
+        </w:rPr>
+        <w:t xml:space="preserve"> et al., 2024). As a result, a single best-fitting parameter set may not fully represent the uncertainty in the calibration result.</w:t>
+      </w:r>
+    </w:p>
+    <w:p>
+      <w:pPr>
+        <w:rPr>
+          <w:rFonts w:ascii="Times New Roman Regular" w:eastAsia="宋体" w:hAnsi="Times New Roman Regular" w:cs="Times New Roman Regular"/>
+        </w:rPr>
+      </w:pPr>
+    </w:p>
+    <w:p>
+      <w:pPr>
+        <w:rPr>
+          <w:rFonts w:ascii="Times New Roman Regular" w:eastAsia="宋体" w:hAnsi="Times New Roman Regular" w:cs="Times New Roman Regular"/>
+        </w:rPr>
+      </w:pPr>
+      <w:r>
+        <w:rPr>
+          <w:rFonts w:ascii="Times New Roman Regular" w:eastAsia="宋体" w:hAnsi="Times New Roman Regular" w:cs="Times New Roman Regular"/>
+        </w:rPr>
         <w:t xml:space="preserve">For this reason, uncertainty-aware calibration is important. The objective is not only to </w:t>
       </w:r>
       <w:r>
@@ -866,7 +1236,21 @@
           <w:rFonts w:ascii="Times New Roman Regular" w:eastAsia="宋体" w:hAnsi="Times New Roman Regular" w:cs="Times New Roman Regular"/>
         </w:rPr>
         <w:lastRenderedPageBreak/>
-        <w:t>find the parameter values that minimise the difference between simulated and measured chlorine time series, but also to consider how reliable those estimated values are and how measurement uncertainty affects subsequent interpretation. This is especially relevant when calibrated model outputs are used to assess whether chlorine residual may fall below a required threshold. A concentration close to the threshold may be interpreted differently depending on the uncertainty of the measurement and the uncertainty introduced through calibration. Therefore, uncertainty-aware parameter estimation provides a more appropriate basis for linking chlorine decay modelling with threshold-based water quality risk assessment.</w:t>
+        <w:t xml:space="preserve">find the parameter values that </w:t>
+      </w:r>
+      <w:proofErr w:type="spellStart"/>
+      <w:r>
+        <w:rPr>
+          <w:rFonts w:ascii="Times New Roman Regular" w:eastAsia="宋体" w:hAnsi="Times New Roman Regular" w:cs="Times New Roman Regular"/>
+        </w:rPr>
+        <w:t>minimise</w:t>
+      </w:r>
+      <w:proofErr w:type="spellEnd"/>
+      <w:r>
+        <w:rPr>
+          <w:rFonts w:ascii="Times New Roman Regular" w:eastAsia="宋体" w:hAnsi="Times New Roman Regular" w:cs="Times New Roman Regular"/>
+        </w:rPr>
+        <w:t xml:space="preserve"> the difference between simulated and measured chlorine time series, but also to consider how reliable those estimated values are and how measurement uncertainty affects subsequent interpretation. This is especially relevant when calibrated model outputs are used to assess whether chlorine residual may fall below a required threshold. A concentration close to the threshold may be interpreted differently depending on the uncertainty of the measurement and the uncertainty introduced through calibration. Therefore, uncertainty-aware parameter estimation provides a more appropriate basis for linking chlorine decay modelling with threshold-based water quality risk assessment.</w:t>
       </w:r>
     </w:p>
     <w:p>
@@ -901,47 +1285,159 @@
         <w:rPr>
           <w:rFonts w:eastAsia="宋体"/>
         </w:rPr>
-        <w:t>Several approaches can be used for chlorine decay model calibration. Deterministic optimisation methods, such as least-squares minimisation, grid search, and genetic algorithms, aim to identify the parameter set that gives the best agreement between simulated and observed chlorine concentrations. These methods are useful for finding best-fitting parameters, but they may provide limited information about parameter uncertainty when different parameter combinations produce similar model outputs. Bayesian approaches can represent parameter uncertainty more formally through posterior distributions, but they require explicit assumptions about prior distributions, likelihood functions, and measurement error models, and may be computationally more demanding.</w:t>
-      </w:r>
-    </w:p>
-    <w:p>
-      <w:pPr>
+        <w:t xml:space="preserve">Several approaches can be used for chlorine decay model calibration. Deterministic </w:t>
+      </w:r>
+      <w:proofErr w:type="spellStart"/>
+      <w:r>
         <w:rPr>
           <w:rFonts w:eastAsia="宋体"/>
         </w:rPr>
-      </w:pPr>
-    </w:p>
-    <w:p>
-      <w:pPr>
+        <w:t>optimisation</w:t>
+      </w:r>
+      <w:proofErr w:type="spellEnd"/>
+      <w:r>
         <w:rPr>
           <w:rFonts w:eastAsia="宋体"/>
         </w:rPr>
-      </w:pPr>
+        <w:t xml:space="preserve"> methods, such as least-squares </w:t>
+      </w:r>
+      <w:proofErr w:type="spellStart"/>
       <w:r>
         <w:rPr>
           <w:rFonts w:eastAsia="宋体"/>
         </w:rPr>
-        <w:t xml:space="preserve">The Generalised Likelihood Uncertainty Estimation (GLUE) framework provides an alternative uncertainty-aware approach (Beven and Binley, 1992). Instead of relying only on a single best-fitting parameter set, GLUE evaluates many candidate parameter sets and retains those that reproduce the observations within an acceptable error range. These are referred to as behavioural parameter sets. This is suitable for wall reaction coefficient calibration because different combinations of wall reaction coefficients may </w:t>
-      </w:r>
+        <w:t>minimisation</w:t>
+      </w:r>
+      <w:proofErr w:type="spellEnd"/>
       <w:r>
         <w:rPr>
           <w:rFonts w:eastAsia="宋体"/>
         </w:rPr>
+        <w:t>, grid search, and genetic algorithms, aim to identify the parameter set that gives the best agreement between simulated and observed chlorine concentrations. These methods are useful for finding best-fitting parameters, but they may provide limited information about parameter uncertainty when different parameter combinations produce similar model outputs. Bayesian approaches can represent parameter uncertainty more formally through posterior distributions, but they require explicit assumptions about prior distributions, likelihood functions, and measurement error models, and may be computationally more demanding.</w:t>
+      </w:r>
+    </w:p>
+    <w:p>
+      <w:pPr>
+        <w:rPr>
+          <w:rFonts w:eastAsia="宋体"/>
+        </w:rPr>
+      </w:pPr>
+    </w:p>
+    <w:p>
+      <w:pPr>
+        <w:rPr>
+          <w:rFonts w:eastAsia="宋体"/>
+        </w:rPr>
+      </w:pPr>
+      <w:r>
+        <w:rPr>
+          <w:rFonts w:eastAsia="宋体"/>
+        </w:rPr>
+        <w:t xml:space="preserve">The </w:t>
+      </w:r>
+      <w:proofErr w:type="spellStart"/>
+      <w:r>
+        <w:rPr>
+          <w:rFonts w:eastAsia="宋体"/>
+        </w:rPr>
+        <w:t>Generalised</w:t>
+      </w:r>
+      <w:proofErr w:type="spellEnd"/>
+      <w:r>
+        <w:rPr>
+          <w:rFonts w:eastAsia="宋体"/>
+        </w:rPr>
+        <w:t xml:space="preserve"> Likelihood Uncertainty Estimation (GLUE) framework provides an alternative uncertainty-aware approach (</w:t>
+      </w:r>
+      <w:proofErr w:type="spellStart"/>
+      <w:r>
+        <w:rPr>
+          <w:rFonts w:eastAsia="宋体"/>
+        </w:rPr>
+        <w:t>Beven</w:t>
+      </w:r>
+      <w:proofErr w:type="spellEnd"/>
+      <w:r>
+        <w:rPr>
+          <w:rFonts w:eastAsia="宋体"/>
+        </w:rPr>
+        <w:t xml:space="preserve"> and Binley, 1992). Instead of relying only on a single best-fitting parameter set, GLUE evaluates many </w:t>
+      </w:r>
+      <w:proofErr w:type="gramStart"/>
+      <w:r>
+        <w:rPr>
+          <w:rFonts w:eastAsia="宋体"/>
+        </w:rPr>
+        <w:t>candidate</w:t>
+      </w:r>
+      <w:proofErr w:type="gramEnd"/>
+      <w:r>
+        <w:rPr>
+          <w:rFonts w:eastAsia="宋体"/>
+        </w:rPr>
+        <w:t xml:space="preserve"> parameter sets and retains those that reproduce the observations within an acceptable error range. These are referred to as </w:t>
+      </w:r>
+      <w:proofErr w:type="spellStart"/>
+      <w:r>
+        <w:rPr>
+          <w:rFonts w:eastAsia="宋体"/>
+        </w:rPr>
+        <w:t>behavioural</w:t>
+      </w:r>
+      <w:proofErr w:type="spellEnd"/>
+      <w:r>
+        <w:rPr>
+          <w:rFonts w:eastAsia="宋体"/>
+        </w:rPr>
+        <w:t xml:space="preserve"> parameter sets. This is suitable for wall reaction coefficient calibration because different combinations of wall reaction coefficients may </w:t>
+      </w:r>
+      <w:r>
+        <w:rPr>
+          <w:rFonts w:eastAsia="宋体"/>
+        </w:rPr>
         <w:lastRenderedPageBreak/>
-        <w:t>generate similar chlorine residual time series at the available monitoring locations. The behavioural parameter sets can then be used to describe uncertainty in the estimated wall reaction coefficients and to propagate this uncertainty into threshold-based chlorine risk assessment.</w:t>
-      </w:r>
-    </w:p>
-    <w:p>
-      <w:pPr>
+        <w:t xml:space="preserve">generate similar chlorine residual time series at the available monitoring locations. The </w:t>
+      </w:r>
+      <w:proofErr w:type="spellStart"/>
+      <w:r>
         <w:rPr>
           <w:rFonts w:eastAsia="宋体"/>
         </w:rPr>
-      </w:pPr>
+        <w:t>behavioural</w:t>
+      </w:r>
+      <w:proofErr w:type="spellEnd"/>
       <w:r>
         <w:rPr>
           <w:rFonts w:eastAsia="宋体"/>
         </w:rPr>
-        <w:t>However, GLUE also involves subjective choices, including the definition of the likelihood measure, the behavioural threshold, the parameter ranges, and the sampling strategy. Therefore, GLUE results should be interpreted as a practical uncertainty representation rather than a unique statistical posterior distribution.</w:t>
+        <w:t xml:space="preserve"> parameter sets can then be used to describe uncertainty in the estimated wall reaction coefficients and to propagate this uncertainty into threshold-based chlorine risk assessment.</w:t>
+      </w:r>
+    </w:p>
+    <w:p>
+      <w:pPr>
+        <w:rPr>
+          <w:rFonts w:eastAsia="宋体"/>
+        </w:rPr>
+      </w:pPr>
+      <w:r>
+        <w:rPr>
+          <w:rFonts w:eastAsia="宋体"/>
+        </w:rPr>
+        <w:t xml:space="preserve">However, GLUE also involves subjective choices, including the definition of the likelihood measure, the </w:t>
+      </w:r>
+      <w:proofErr w:type="spellStart"/>
+      <w:r>
+        <w:rPr>
+          <w:rFonts w:eastAsia="宋体"/>
+        </w:rPr>
+        <w:t>behavioural</w:t>
+      </w:r>
+      <w:proofErr w:type="spellEnd"/>
+      <w:r>
+        <w:rPr>
+          <w:rFonts w:eastAsia="宋体"/>
+        </w:rPr>
+        <w:t xml:space="preserve"> threshold, the parameter ranges, and the sampling strategy. Therefore, GLUE results should be interpreted as a practical uncertainty representation rather than a unique statistical posterior distribution.</w:t>
       </w:r>
     </w:p>
     <w:p>
@@ -1025,11 +1521,35 @@
     </w:p>
     <w:p>
       <w:r>
-        <w:t xml:space="preserve">The study system is the Net3 benchmark water distribution network implemented in WNTR with the EPANET simulation engine (Klise et al., 2017; Rossman et al., 2020). Net3 is used as a controlled synthetic case study because its network topology, hydraulic properties, demand patterns, reservoirs, tanks and pipe characteristics are predefined. This makes it possible to prescribe known wall reaction coefficients and observation uncertainty explicitly, and then evaluate whether the inverse calibration </w:t>
+        <w:t>The study system is the Net3 benchmark water distribution network implemented in WNTR with the EPANET simulation engine (</w:t>
+      </w:r>
+      <w:proofErr w:type="spellStart"/>
+      <w:r>
+        <w:t>Klise</w:t>
+      </w:r>
+      <w:proofErr w:type="spellEnd"/>
+      <w:r>
+        <w:t xml:space="preserve"> et al., 2017; Rossman et al., 2020). Net3 is used as a controlled synthetic case study because its network topology, hydraulic properties, demand patterns, reservoirs, tanks and pipe characteristics are predefined. This makes it possible to prescribe known wall reaction coefficients and observation uncertainty </w:t>
+      </w:r>
+      <w:proofErr w:type="gramStart"/>
+      <w:r>
+        <w:t>explicitly, and</w:t>
+      </w:r>
+      <w:proofErr w:type="gramEnd"/>
+      <w:r>
+        <w:t xml:space="preserve"> then evaluate whether the inverse calibration </w:t>
       </w:r>
       <w:r>
         <w:lastRenderedPageBreak/>
-        <w:t>procedure can recover the imposed wall-decay behaviour from noisy synthetic chlorine observations.</w:t>
+        <w:t xml:space="preserve">procedure can recover the imposed wall-decay </w:t>
+      </w:r>
+      <w:proofErr w:type="spellStart"/>
+      <w:r>
+        <w:t>behaviour</w:t>
+      </w:r>
+      <w:proofErr w:type="spellEnd"/>
+      <w:r>
+        <w:t xml:space="preserve"> from noisy synthetic chlorine observations.</w:t>
       </w:r>
     </w:p>
     <w:p/>
@@ -1041,13 +1561,37 @@
     <w:p/>
     <w:p>
       <w:r>
-        <w:t>In the inverse calibration stage, the noisy synthetic observations are treated as the calibration data. Candidate grouped wall reaction coefficients are tested by repeatedly running the WNTR/EPANET chlorine transport model and comparing simulated chlorine concentrations with the synthetic observations. A deterministic grid-search calibration is first used as a diagnostic recovery check. The main uncertainty-aware calibration is then performed using the Generalised Likelihood Uncertainty Estimation (GLUE) framework, which retains behavioural parameter sets rather than relying only on a single best-fitting parameter vector.</w:t>
-      </w:r>
-    </w:p>
-    <w:p/>
-    <w:p>
-      <w:r>
-        <w:t>The retained GLUE behavioural ensemble is finally propagated through the full Net3 network to quantify predictive uncertainty in simulated residual chlorine. This ensemble is then converted into a threshold-based low-chlorine risk metric, defined as the probability that simulated residual chlorine falls below a specified minimum threshold. The workflow therefore links synthetic chlorine observation generation, grouped wall-decay calibration, parameter uncertainty propagation and network-wide low-chlorine risk assessment within one controlled Net3 experiment.</w:t>
+        <w:t xml:space="preserve">In the inverse calibration stage, the noisy synthetic observations are treated as the calibration data. Candidate grouped wall reaction coefficients are tested by repeatedly running the WNTR/EPANET chlorine transport model and comparing simulated chlorine concentrations with the synthetic observations. A deterministic grid-search calibration is first used as a diagnostic recovery check. The main uncertainty-aware calibration is then performed using the </w:t>
+      </w:r>
+      <w:proofErr w:type="spellStart"/>
+      <w:r>
+        <w:t>Generalised</w:t>
+      </w:r>
+      <w:proofErr w:type="spellEnd"/>
+      <w:r>
+        <w:t xml:space="preserve"> Likelihood Uncertainty Estimation (GLUE) framework, which retains </w:t>
+      </w:r>
+      <w:proofErr w:type="spellStart"/>
+      <w:r>
+        <w:t>behavioural</w:t>
+      </w:r>
+      <w:proofErr w:type="spellEnd"/>
+      <w:r>
+        <w:t xml:space="preserve"> parameter sets rather than relying only on a single best-fitting parameter vector.</w:t>
+      </w:r>
+    </w:p>
+    <w:p/>
+    <w:p>
+      <w:r>
+        <w:t xml:space="preserve">The retained GLUE </w:t>
+      </w:r>
+      <w:proofErr w:type="spellStart"/>
+      <w:r>
+        <w:t>behavioural</w:t>
+      </w:r>
+      <w:proofErr w:type="spellEnd"/>
+      <w:r>
+        <w:t xml:space="preserve"> ensemble is finally propagated through the full Net3 network to quantify predictive uncertainty in simulated residual chlorine. This ensemble is then converted into a threshold-based low-chlorine risk metric, defined as the probability that simulated residual chlorine falls below a specified minimum threshold. The workflow therefore links synthetic chlorine observation generation, grouped wall-decay calibration, parameter uncertainty propagation and network-wide low-chlorine risk assessment within one controlled Net3 experiment.</w:t>
       </w:r>
     </w:p>
     <w:p>
@@ -1065,7 +1609,23 @@
     <w:p>
       <w:r>
         <w:lastRenderedPageBreak/>
-        <w:t>Hydraulic and free chlorine transport simulations were carried out in WNTR using the EPANET simulation engine (Klise et al., 2017; Rossman et al., 2020). Free chlorine was modelled as a reactive water-quality constituent transported through the Net3 hydraulic network. The hydraulic simulation provides the flow directions, pipe flows, velocities, tank behaviour and mixing conditions required for chlorine transport modelling. Chlorine is transported by advection through pipes and mixed at junctions and storage tanks according to the EPANET water-quality model.</w:t>
+        <w:t>Hydraulic and free chlorine transport simulations were carried out in WNTR using the EPANET simulation engine (</w:t>
+      </w:r>
+      <w:proofErr w:type="spellStart"/>
+      <w:r>
+        <w:t>Klise</w:t>
+      </w:r>
+      <w:proofErr w:type="spellEnd"/>
+      <w:r>
+        <w:t xml:space="preserve"> et al., 2017; Rossman et al., 2020). Free chlorine was modelled as a reactive water-quality constituent transported through the Net3 hydraulic network. The hydraulic simulation provides the flow directions, pipe flows, velocities, tank </w:t>
+      </w:r>
+      <w:proofErr w:type="spellStart"/>
+      <w:r>
+        <w:t>behaviour</w:t>
+      </w:r>
+      <w:proofErr w:type="spellEnd"/>
+      <w:r>
+        <w:t xml:space="preserve"> and mixing conditions required for chlorine transport modelling. Chlorine is transported by advection through pipes and mixed at junctions and storage tanks according to the EPANET water-quality model.</w:t>
       </w:r>
     </w:p>
     <w:p/>
@@ -1637,31 +2197,79 @@
     <w:p/>
     <w:p>
       <w:r>
-        <w:t>For example, the fixed bulk decay coefficient k_b = -0.5 day⁻¹ corresponds to -5.79 × 10⁻⁶ s⁻¹. The imposed wall reaction coefficients k_w = -1.0, -0.1 and -0.05 m day⁻¹ correspond to -1.16 × 10⁻⁵, -1.16 × 10⁻⁶ and -5.79 × 10⁻⁷ m s⁻¹, respectively. Model outputs are reported as chlorine concentration in mg/L and simulation time in hours.</w:t>
-      </w:r>
-    </w:p>
-    <w:p/>
-    <w:p>
-      <w:r>
-        <w:t>The chlorine boundary condition was imposed at the source nodes. In the baseline Net3 synthetic simulations, the reservoir chlorine concentration was set to 1.0 mg/L and the initial tank chlorine concentration was set to 0.5 mg/L. These values define the upstream and storage water-quality conditions from which chlorine residual is transported, mixed and decayed through the network.</w:t>
-      </w:r>
-    </w:p>
-    <w:p/>
-    <w:p>
-      <w:r>
-        <w:t>To ensure that the same forward modelling procedure was used consistently throughout the analysis, the WNTR/EPANET simulation was implemented through a reusable Python simulation wrapper, referred to in the code as simulate_chlorine. For a specified Net3 model, bulk decay coefficient, pipe-level or group-level wall reaction coefficients, source chlorine conditions, simulation duration, time-step settings, warm-up period and output nodes, the wrapper assigns the reaction parameters and source quality conditions, runs the EPANET water-quality simulation through WNTR, removes the warm-up period and returns chlorine concentration time series.</w:t>
-      </w:r>
-    </w:p>
-    <w:p/>
-    <w:p>
-      <w:r>
-        <w:t>This wrapper was used in three stages of the analysis. First, it generated the synthetic true chlorine concentrations under the imposed wall reaction coefficients. Second, it was repeatedly called during inverse calibration to evaluate candidate grouped wall reaction coefficient vectors. Third, it was used to propagate the retained GLUE behavioural parameter sets through the network for predictive uncertainty and threshold-based low-chlorine risk assessment.</w:t>
-      </w:r>
-    </w:p>
-    <w:p/>
-    <w:p>
-      <w:r>
-        <w:t>The Net3 simulations were run over a 72 h period. The hydraulic time step was set to 1 h, the reporting time step was set to 1 h and the water-quality time step was set to 5 min. The first 24 h were excluded as a warm-up period to reduce the influence of arbitrary initial water-quality conditions. The post-warm-up hourly chlorine concentration time series were then used for synthetic observation generation, inverse calibration and uncertainty propagation.</w:t>
+        <w:t xml:space="preserve">For example, the fixed bulk decay coefficient </w:t>
+      </w:r>
+      <w:proofErr w:type="spellStart"/>
+      <w:r>
+        <w:t>k_b</w:t>
+      </w:r>
+      <w:proofErr w:type="spellEnd"/>
+      <w:r>
+        <w:t xml:space="preserve"> = -0.5 day⁻¹ corresponds to -5.79 × 10⁻⁶ s⁻¹. The imposed wall reaction coefficients </w:t>
+      </w:r>
+      <w:proofErr w:type="spellStart"/>
+      <w:r>
+        <w:t>k_w</w:t>
+      </w:r>
+      <w:proofErr w:type="spellEnd"/>
+      <w:r>
+        <w:t xml:space="preserve"> = -1.0, -0.1 and -0.05 m day⁻¹ correspond to -1.16 × 10⁻⁵, -1.16 × 10⁻⁶ and -5.79 × 10⁻⁷ m s⁻¹, respectively. Model outputs are reported as chlorine concentration in mg/L and simulation time in hours.</w:t>
+      </w:r>
+    </w:p>
+    <w:p/>
+    <w:p>
+      <w:r>
+        <w:t>The chlorine boundary condition was imposed at the source nodes. In the baseline Net3 synthetic simulations, the reservoir chlorine concentration was set to 1.0 mg/</w:t>
+      </w:r>
+      <w:proofErr w:type="gramStart"/>
+      <w:r>
+        <w:t>L</w:t>
+      </w:r>
+      <w:proofErr w:type="gramEnd"/>
+      <w:r>
+        <w:t xml:space="preserve"> and the initial tank chlorine concentration was set to 0.5 mg/L. These values define the upstream and storage water-quality conditions from which chlorine residual is transported, mixed and decayed through the network.</w:t>
+      </w:r>
+    </w:p>
+    <w:p/>
+    <w:p>
+      <w:r>
+        <w:t xml:space="preserve">To ensure that the same forward modelling procedure was used consistently throughout the analysis, the WNTR/EPANET simulation was implemented through a reusable Python simulation wrapper, referred to in the code as </w:t>
+      </w:r>
+      <w:proofErr w:type="spellStart"/>
+      <w:r>
+        <w:t>simulate_chlorine</w:t>
+      </w:r>
+      <w:proofErr w:type="spellEnd"/>
+      <w:r>
+        <w:t>. For a specified Net3 model, bulk decay coefficient, pipe-level or group-level wall reaction coefficients, source chlorine conditions, simulation duration, time-step settings, warm-up period and output nodes, the wrapper assigns the reaction parameters and source quality conditions, runs the EPANET water-quality simulation through WNTR, removes the warm-up period and returns chlorine concentration time series.</w:t>
+      </w:r>
+    </w:p>
+    <w:p/>
+    <w:p>
+      <w:r>
+        <w:t xml:space="preserve">This wrapper was used in three stages of the analysis. First, it generated the synthetic true chlorine concentrations under the imposed wall reaction coefficients. Second, it was repeatedly called during inverse calibration to evaluate candidate grouped wall reaction coefficient vectors. Third, it was used to propagate the retained GLUE </w:t>
+      </w:r>
+      <w:proofErr w:type="spellStart"/>
+      <w:r>
+        <w:t>behavioural</w:t>
+      </w:r>
+      <w:proofErr w:type="spellEnd"/>
+      <w:r>
+        <w:t xml:space="preserve"> parameter sets through the network for predictive uncertainty and threshold-based low-chlorine risk assessment.</w:t>
+      </w:r>
+    </w:p>
+    <w:p/>
+    <w:p>
+      <w:r>
+        <w:t xml:space="preserve">The Net3 simulations were run over a </w:t>
+      </w:r>
+      <w:proofErr w:type="gramStart"/>
+      <w:r>
+        <w:t>72 h</w:t>
+      </w:r>
+      <w:proofErr w:type="gramEnd"/>
+      <w:r>
+        <w:t xml:space="preserve"> period. The hydraulic time step was set to 1 h, the reporting time step was set to 1 h and the water-quality time step was set to 5 min. The first 24 h were excluded as a warm-up period to reduce the influence of arbitrary initial water-quality conditions. The post-warm-up hourly chlorine concentration time series were then used for synthetic observation generation, inverse calibration and uncertainty propagation.</w:t>
       </w:r>
     </w:p>
     <w:p>
@@ -1694,7 +2302,15 @@
     </w:p>
     <w:p>
       <w:r>
-        <w:t>In addition to the reactive chlorine simulations, a water-age diagnostic simulation was performed using the same Net3 hydraulic model. Water age represents the residence time of water within the distribution network and provides a hydraulic indicator of the time available for chlorine decay reactions to occur. In this study, water age was used as an explanatory diagnostic rather than as a calibration variable. It was not included in the RMSE objective function, the deterministic grid-search calibration, or the GLUE behavioural screening. It is therefore not presented as a primary quantitative Results output with dedicated water-age tables or maps; residual chlorine fields and threshold-risk maps provide the main quantitative evidence.</w:t>
+        <w:t xml:space="preserve">In addition to the reactive chlorine simulations, a water-age diagnostic simulation was performed using the same Net3 hydraulic model. Water age represents the residence time of water within the distribution network and provides a hydraulic indicator of the time available for chlorine decay reactions to occur. In this study, water age was used as an explanatory diagnostic rather than as a calibration variable. It was not included in the RMSE objective function, the deterministic grid-search calibration, or the GLUE </w:t>
+      </w:r>
+      <w:proofErr w:type="spellStart"/>
+      <w:r>
+        <w:t>behavioural</w:t>
+      </w:r>
+      <w:proofErr w:type="spellEnd"/>
+      <w:r>
+        <w:t xml:space="preserve"> screening. It is therefore not presented as a primary quantitative Results output with dedicated water-age tables or maps; residual chlorine fields and threshold-risk maps provide the main quantitative evidence.</w:t>
       </w:r>
     </w:p>
     <w:p/>
@@ -1728,7 +2344,15 @@
     </w:p>
     <w:p>
       <w:r>
-        <w:t>To create a controlled spatially heterogeneous wall-decay field in the Net3 network, pipes were assigned to three synthetic pipe-wall reactivity groups. These groups represent high-, medium- and low-wall-decay behaviour and are used to generate the synthetic true chlorine concentrations for the calibration experiment. The grouping is synthetic and should not be interpreted as verified pipe age or material information in the original Net3 network.</w:t>
+        <w:t xml:space="preserve">To create a controlled spatially heterogeneous wall-decay field in the Net3 network, pipes were assigned to three synthetic pipe-wall reactivity groups. These groups represent high-, medium- and low-wall-decay </w:t>
+      </w:r>
+      <w:proofErr w:type="spellStart"/>
+      <w:r>
+        <w:t>behaviour</w:t>
+      </w:r>
+      <w:proofErr w:type="spellEnd"/>
+      <w:r>
+        <w:t xml:space="preserve"> and are used to generate the synthetic true chlorine concentrations for the calibration experiment. The grouping is synthetic and should not be interpreted as verified pipe age or material information in the original Net3 network.</w:t>
       </w:r>
     </w:p>
     <w:p/>
@@ -2287,7 +2911,15 @@
         <w:t xml:space="preserve"> </w:t>
       </w:r>
       <w:r>
-        <w:t>The grouped formulation deliberately reduces the dimensionality of the inverse problem, making it possible to test whether limited monitoring data can recover spatially structured wall-decay behaviour.</w:t>
+        <w:t xml:space="preserve">The grouped formulation deliberately reduces the dimensionality of the inverse problem, making it possible to test whether limited monitoring data can recover spatially structured wall-decay </w:t>
+      </w:r>
+      <w:proofErr w:type="spellStart"/>
+      <w:r>
+        <w:t>behaviour</w:t>
+      </w:r>
+      <w:proofErr w:type="spellEnd"/>
+      <w:r>
+        <w:t>.</w:t>
       </w:r>
     </w:p>
     <w:p>
@@ -2336,7 +2968,15 @@
       </w:r>
       <w:r>
         <w:lastRenderedPageBreak/>
-        <w:t>chlorine sensitivity at those locations. The resulting time series are used to test whether the inverse calibration procedure can infer grouped wall reaction behaviour from these limited monitoring locations.</w:t>
+        <w:t xml:space="preserve">chlorine sensitivity at those locations. The resulting time series are used to test whether the inverse calibration procedure can infer grouped wall reaction </w:t>
+      </w:r>
+      <w:proofErr w:type="spellStart"/>
+      <w:r>
+        <w:t>behaviour</w:t>
+      </w:r>
+      <w:proofErr w:type="spellEnd"/>
+      <w:r>
+        <w:t xml:space="preserve"> from these limited monitoring locations.</w:t>
       </w:r>
     </w:p>
     <w:p/>
@@ -3274,13 +3914,37 @@
     <w:p/>
     <w:p>
       <w:r>
-        <w:t>For each noise level, 200 independent Monte Carlo noise realisations were generated. In each realisation, random Gaussian error was added to the same underlying true chlorine time series, and the effective first-order decay coefficient was re-estimated using the same calibration procedure. This produced a distribution of estimated effective first-order decay coefficients for each assumed noise level.</w:t>
-      </w:r>
-    </w:p>
-    <w:p/>
-    <w:p>
-      <w:r>
-        <w:t>The sensitivity results were summarised using the mean and standard deviation of the estimated effective first-order decay coefficient distribution for each noise level. The mean was used to assess whether increasing measurement noise introduced systematic bias in the fitted coefficient, while the standard deviation was used to quantify how the uncertainty of the estimate increased with observation-noise magnitude.</w:t>
+        <w:t xml:space="preserve">For each noise level, 200 independent Monte Carlo noise </w:t>
+      </w:r>
+      <w:proofErr w:type="spellStart"/>
+      <w:r>
+        <w:t>realisations</w:t>
+      </w:r>
+      <w:proofErr w:type="spellEnd"/>
+      <w:r>
+        <w:t xml:space="preserve"> were generated. In each </w:t>
+      </w:r>
+      <w:proofErr w:type="spellStart"/>
+      <w:r>
+        <w:t>realisation</w:t>
+      </w:r>
+      <w:proofErr w:type="spellEnd"/>
+      <w:r>
+        <w:t>, random Gaussian error was added to the same underlying true chlorine time series, and the effective first-order decay coefficient was re-estimated using the same calibration procedure. This produced a distribution of estimated effective first-order decay coefficients for each assumed noise level.</w:t>
+      </w:r>
+    </w:p>
+    <w:p/>
+    <w:p>
+      <w:r>
+        <w:t xml:space="preserve">The sensitivity results were </w:t>
+      </w:r>
+      <w:proofErr w:type="spellStart"/>
+      <w:r>
+        <w:t>summarised</w:t>
+      </w:r>
+      <w:proofErr w:type="spellEnd"/>
+      <w:r>
+        <w:t xml:space="preserve"> using the mean and standard deviation of the estimated effective first-order decay coefficient distribution for each noise level. The mean was used to assess whether increasing measurement noise introduced systematic bias in the fitted coefficient, while the standard deviation was used to quantify how the uncertainty of the estimate increased with observation-noise magnitude.</w:t>
       </w:r>
       <m:oMath>
         <m:r>
@@ -4626,17 +5290,57 @@
     <w:p/>
     <w:p>
       <w:r>
-        <w:t>over predefined physically plausible ranges. Candidate values were constrained to be non-positive because wall reaction represents chlorine consumption at the pipe boundary. The search ranges were selected to include weak, intermediate and strong wall-decay behaviour, with stronger wall reaction expected for the old pipe-wall reactivity group and weaker wall reaction expected for the new group.</w:t>
-      </w:r>
-    </w:p>
-    <w:p>
-      <w:r>
-        <w:t>In this implementation the three grouped coefficients were evaluated on a 7×7×7 grid spanning k_w,old in [-1.5, -0.2], k_w,average in [-0.2, -0.04] and k_w,new in [-0.10, -0.005] m/day, chosen so that the imposed synthetic values lay within the search range, although not necessarily on a grid node.</w:t>
-      </w:r>
-    </w:p>
-    <w:p>
-      <w:r>
-        <w:t>To assess the robustness of the deterministic recovery, the synthetic observation generation and grid-search calibration were repeated for ten independent noise realisations under the baseline sigma = 0.1 mg/L scenario.</w:t>
+        <w:t xml:space="preserve">over predefined physically plausible ranges. Candidate values were constrained to be non-positive because wall reaction represents chlorine consumption at the pipe boundary. The search ranges were selected to include weak, intermediate and strong wall-decay </w:t>
+      </w:r>
+      <w:proofErr w:type="spellStart"/>
+      <w:r>
+        <w:t>behaviour</w:t>
+      </w:r>
+      <w:proofErr w:type="spellEnd"/>
+      <w:r>
+        <w:t>, with stronger wall reaction expected for the old pipe-wall reactivity group and weaker wall reaction expected for the new group.</w:t>
+      </w:r>
+    </w:p>
+    <w:p>
+      <w:r>
+        <w:t xml:space="preserve">In this implementation the three grouped coefficients were evaluated on a 7×7×7 grid spanning </w:t>
+      </w:r>
+      <w:proofErr w:type="spellStart"/>
+      <w:r>
+        <w:t>k_w,old</w:t>
+      </w:r>
+      <w:proofErr w:type="spellEnd"/>
+      <w:r>
+        <w:t xml:space="preserve"> in [-1.5, -0.2], </w:t>
+      </w:r>
+      <w:proofErr w:type="spellStart"/>
+      <w:r>
+        <w:t>k_w,average</w:t>
+      </w:r>
+      <w:proofErr w:type="spellEnd"/>
+      <w:r>
+        <w:t xml:space="preserve"> in [-0.2, -0.04] and </w:t>
+      </w:r>
+      <w:proofErr w:type="spellStart"/>
+      <w:r>
+        <w:t>k_w,new</w:t>
+      </w:r>
+      <w:proofErr w:type="spellEnd"/>
+      <w:r>
+        <w:t xml:space="preserve"> in [-0.10, -0.005] m/day, chosen so that the imposed synthetic values lay within the search range, although not necessarily on a grid node.</w:t>
+      </w:r>
+    </w:p>
+    <w:p>
+      <w:r>
+        <w:t xml:space="preserve">To assess the robustness of the deterministic recovery, the synthetic observation generation and grid-search calibration were repeated for ten independent noise </w:t>
+      </w:r>
+      <w:proofErr w:type="spellStart"/>
+      <w:r>
+        <w:t>realisations</w:t>
+      </w:r>
+      <w:proofErr w:type="spellEnd"/>
+      <w:r>
+        <w:t xml:space="preserve"> under the baseline sigma = 0.1 mg/L scenario.</w:t>
       </w:r>
     </w:p>
     <w:p/>
@@ -4844,7 +5548,15 @@
     <w:p/>
     <w:p>
       <w:r>
-        <w:t>For this reason, the grid-search result was used only as a diagnostic benchmark. The main uncertainty-aware calibration result was obtained using the GLUE behavioural ensemble described in the following section.</w:t>
+        <w:t xml:space="preserve">For this reason, the grid-search result was used only as a diagnostic benchmark. The main uncertainty-aware calibration result was obtained using the GLUE </w:t>
+      </w:r>
+      <w:proofErr w:type="spellStart"/>
+      <w:r>
+        <w:t>behavioural</w:t>
+      </w:r>
+      <w:proofErr w:type="spellEnd"/>
+      <w:r>
+        <w:t xml:space="preserve"> ensemble described in the following section.</w:t>
       </w:r>
     </w:p>
     <w:p/>
@@ -4867,7 +5579,23 @@
     </w:p>
     <w:p>
       <w:r>
-        <w:t>The main uncertainty-aware calibration method used in this study was based on the GLUE framework (Beven and Binley, 1992). Unlike the deterministic grid search, which identifies a single best-fitting parameter vector, GLUE retains an ensemble of behavioural parameter sets that reproduce the synthetic chlorine observations within an acceptable error range. This is appropriate for the grouped wall-decay calibration problem because different combinations of wall reaction coefficients may produce similar chlorine time series at the available monitoring nodes.</w:t>
+        <w:t>The main uncertainty-aware calibration method used in this study was based on the GLUE framework (</w:t>
+      </w:r>
+      <w:proofErr w:type="spellStart"/>
+      <w:r>
+        <w:t>Beven</w:t>
+      </w:r>
+      <w:proofErr w:type="spellEnd"/>
+      <w:r>
+        <w:t xml:space="preserve"> and Binley, 1992). Unlike the deterministic grid search, which identifies a single best-fitting parameter vector, GLUE retains an ensemble of </w:t>
+      </w:r>
+      <w:proofErr w:type="spellStart"/>
+      <w:r>
+        <w:t>behavioural</w:t>
+      </w:r>
+      <w:proofErr w:type="spellEnd"/>
+      <w:r>
+        <w:t xml:space="preserve"> parameter sets that reproduce the synthetic chlorine observations within an acceptable error range. This is appropriate for the grouped wall-decay calibration problem because different combinations of wall reaction coefficients may produce similar chlorine time series at the available monitoring nodes.</w:t>
       </w:r>
     </w:p>
     <w:p/>
@@ -5598,7 +6326,15 @@
     <w:p/>
     <w:p>
       <w:r>
-        <w:t>A behavioural threshold was then applied to identify parameter sets that reproduced the observations sufficiently well:</w:t>
+        <w:t xml:space="preserve">A </w:t>
+      </w:r>
+      <w:proofErr w:type="spellStart"/>
+      <w:r>
+        <w:t>behavioural</w:t>
+      </w:r>
+      <w:proofErr w:type="spellEnd"/>
+      <w:r>
+        <w:t xml:space="preserve"> threshold was then applied to identify parameter sets that reproduced the observations sufficiently well:</w:t>
       </w:r>
     </w:p>
     <w:p/>
@@ -5735,7 +6471,15 @@
     <w:p/>
     <w:p>
       <w:r>
-        <w:t>The behavioural indicator was defined as</w:t>
+        <w:t xml:space="preserve">The </w:t>
+      </w:r>
+      <w:proofErr w:type="spellStart"/>
+      <w:r>
+        <w:t>behavioural</w:t>
+      </w:r>
+      <w:proofErr w:type="spellEnd"/>
+      <w:r>
+        <w:t xml:space="preserve"> indicator was defined as</w:t>
       </w:r>
     </w:p>
     <w:p/>
@@ -6079,7 +6823,15 @@
     <w:p/>
     <w:p>
       <w:r>
-        <w:t>In addition to the behavioural classification, an informal Gaussian likelihood was assigned to each sampled parameter vector based on its RMSE:</w:t>
+        <w:t xml:space="preserve">In addition to the </w:t>
+      </w:r>
+      <w:proofErr w:type="spellStart"/>
+      <w:r>
+        <w:t>behavioural</w:t>
+      </w:r>
+      <w:proofErr w:type="spellEnd"/>
+      <w:r>
+        <w:t xml:space="preserve"> classification, an informal Gaussian likelihood was assigned to each sampled parameter vector based on its RMSE:</w:t>
       </w:r>
     </w:p>
     <w:p/>
@@ -6301,9 +7053,11 @@
     </w:p>
     <w:p/>
     <w:p>
+      <w:proofErr w:type="gramStart"/>
       <w:r>
         <w:t>where</w:t>
       </w:r>
+      <w:proofErr w:type="gramEnd"/>
     </w:p>
     <w:p/>
     <w:p>
@@ -6373,7 +7127,23 @@
     <w:p/>
     <w:p>
       <w:r>
-        <w:t>This likelihood was used as an informal GLUE weighting function rather than as a formal Bayesian likelihood. It gives larger weights to behavioural parameter sets with smaller RMSE values, while parameter sets outside the behavioural threshold receive zero weight.</w:t>
+        <w:t xml:space="preserve">This likelihood was used as an informal GLUE weighting function rather than as a formal Bayesian likelihood. It gives larger weights to </w:t>
+      </w:r>
+      <w:proofErr w:type="spellStart"/>
+      <w:r>
+        <w:t>behavioural</w:t>
+      </w:r>
+      <w:proofErr w:type="spellEnd"/>
+      <w:r>
+        <w:t xml:space="preserve"> parameter sets with smaller RMSE values, while parameter sets outside the </w:t>
+      </w:r>
+      <w:proofErr w:type="spellStart"/>
+      <w:r>
+        <w:t>behavioural</w:t>
+      </w:r>
+      <w:proofErr w:type="spellEnd"/>
+      <w:r>
+        <w:t xml:space="preserve"> threshold receive zero weight.</w:t>
       </w:r>
     </w:p>
     <w:p/>
@@ -6615,7 +7385,15 @@
     <w:p>
       <w:r>
         <w:lastRenderedPageBreak/>
-        <w:t xml:space="preserve">Non-behavioural parameter sets have </w:t>
+        <w:t>Non-</w:t>
+      </w:r>
+      <w:proofErr w:type="spellStart"/>
+      <w:r>
+        <w:t>behavioural</w:t>
+      </w:r>
+      <w:proofErr w:type="spellEnd"/>
+      <w:r>
+        <w:t xml:space="preserve"> parameter sets have </w:t>
       </w:r>
       <m:oMath>
         <m:sSub>
@@ -6666,7 +7444,15 @@
     <w:p/>
     <w:p>
       <w:r>
-        <w:t>The output of the GLUE calibration is therefore not a single calibrated wall-decay parameter vector. Instead, it is a weighted behavioural ensemble:</w:t>
+        <w:t xml:space="preserve">The output of the GLUE calibration is therefore not a single calibrated wall-decay parameter vector. Instead, it is a weighted </w:t>
+      </w:r>
+      <w:proofErr w:type="spellStart"/>
+      <w:r>
+        <w:t>behavioural</w:t>
+      </w:r>
+      <w:proofErr w:type="spellEnd"/>
+      <w:r>
+        <w:t xml:space="preserve"> ensemble:</w:t>
       </w:r>
     </w:p>
     <w:p/>
@@ -6830,7 +7616,15 @@
     <w:p/>
     <w:p>
       <w:r>
-        <w:t>This ensemble represents the remaining uncertainty in the grouped wall reaction coefficients after calibration against the noisy synthetic observations. The lowest-RMSE parameter vector can still be reported as a diagnostic best fit, but the main calibration output is the GLUE behavioural ensemble. This ensemble is used in the following sections to propagate wall-decay parameter uncertainty into chlorine prediction uncertainty and threshold-based low-chlorine risk assessment.</w:t>
+        <w:t xml:space="preserve">This ensemble represents the remaining uncertainty in the grouped wall reaction coefficients after calibration against the noisy synthetic observations. The lowest-RMSE parameter vector can still be reported as a diagnostic best fit, but the main calibration output is the GLUE </w:t>
+      </w:r>
+      <w:proofErr w:type="spellStart"/>
+      <w:r>
+        <w:t>behavioural</w:t>
+      </w:r>
+      <w:proofErr w:type="spellEnd"/>
+      <w:r>
+        <w:t xml:space="preserve"> ensemble. This ensemble is used in the following sections to propagate wall-decay parameter uncertainty into chlorine prediction uncertainty and threshold-based low-chlorine risk assessment.</w:t>
       </w:r>
     </w:p>
     <w:p/>
@@ -6848,13 +7642,29 @@
     </w:p>
     <w:p>
       <w:r>
-        <w:t>After the GLUE-based calibration, the retained behavioural parameter sets were propagated through the WNTR/EPANET water-quality model to quantify how uncertainty in the grouped wall reaction coefficients affects simulated chlorine concentrations. The purpose of this step was to move from parameter uncertainty to prediction uncertainty.</w:t>
-      </w:r>
-    </w:p>
-    <w:p/>
-    <w:p>
-      <w:r>
-        <w:t>For each behavioural parameter set,</w:t>
+        <w:t xml:space="preserve">After the GLUE-based calibration, the retained </w:t>
+      </w:r>
+      <w:proofErr w:type="spellStart"/>
+      <w:r>
+        <w:t>behavioural</w:t>
+      </w:r>
+      <w:proofErr w:type="spellEnd"/>
+      <w:r>
+        <w:t xml:space="preserve"> parameter sets were propagated through the WNTR/EPANET water-quality model to quantify how uncertainty in the grouped wall reaction coefficients affects simulated chlorine concentrations. The purpose of this step was to move from parameter uncertainty to prediction uncertainty.</w:t>
+      </w:r>
+    </w:p>
+    <w:p/>
+    <w:p>
+      <w:r>
+        <w:t xml:space="preserve">For each </w:t>
+      </w:r>
+      <w:proofErr w:type="spellStart"/>
+      <w:r>
+        <w:t>behavioural</w:t>
+      </w:r>
+      <w:proofErr w:type="spellEnd"/>
+      <w:r>
+        <w:t xml:space="preserve"> parameter set,</w:t>
       </w:r>
     </w:p>
     <w:p/>
@@ -7497,7 +8307,15 @@
     <w:p/>
     <w:p>
       <w:r>
-        <w:t xml:space="preserve">represents the range of chlorine predictions that are consistent with the noisy synthetic observations, the prior parameter ranges, the behavioural threshold and the GLUE weighting function. Here, </w:t>
+        <w:t xml:space="preserve">represents the range of chlorine predictions that are consistent with the noisy synthetic observations, the prior parameter ranges, the </w:t>
+      </w:r>
+      <w:proofErr w:type="spellStart"/>
+      <w:r>
+        <w:t>behavioural</w:t>
+      </w:r>
+      <w:proofErr w:type="spellEnd"/>
+      <w:r>
+        <w:t xml:space="preserve"> threshold and the GLUE weighting function. Here, </w:t>
       </w:r>
       <m:oMath>
         <m:sSub>
@@ -7527,7 +8345,15 @@
         </m:sSub>
       </m:oMath>
       <w:r>
-        <w:t xml:space="preserve"> is the number of behavioural parameter sets. The spread of this ensemble at a given node and time step reflects the effect of grouped wall-decay parameter uncertainty on predicted residual chlorine.</w:t>
+        <w:t xml:space="preserve"> is the number of behavioural </w:t>
+      </w:r>
+      <w:proofErr w:type="gramStart"/>
+      <w:r>
+        <w:t>parameter</w:t>
+      </w:r>
+      <w:proofErr w:type="gramEnd"/>
+      <w:r>
+        <w:t xml:space="preserve"> sets. The spread of this ensemble at a given node and time step reflects the effect of grouped wall-decay parameter uncertainty on predicted residual chlorine.</w:t>
       </w:r>
     </w:p>
     <w:p/>
@@ -8386,7 +9212,15 @@
     </w:p>
     <w:p>
       <w:r>
-        <w:t xml:space="preserve">After propagating the GLUE behavioural ensemble to chlorine predictions, the prediction ensemble was converted into a threshold-based low-chlorine risk metric. The purpose of this step was to move from chlorine prediction uncertainty to an interpretable </w:t>
+        <w:t xml:space="preserve">After propagating the GLUE </w:t>
+      </w:r>
+      <w:proofErr w:type="spellStart"/>
+      <w:r>
+        <w:t>behavioural</w:t>
+      </w:r>
+      <w:proofErr w:type="spellEnd"/>
+      <w:r>
+        <w:t xml:space="preserve"> ensemble to chlorine predictions, the prediction ensemble was converted into a threshold-based low-chlorine risk metric. The purpose of this step was to move from chlorine prediction uncertainty to an interpretable </w:t>
       </w:r>
       <w:r>
         <w:lastRenderedPageBreak/>
@@ -8476,7 +9310,15 @@
     <w:p/>
     <w:p>
       <w:r>
-        <w:t xml:space="preserve">For each behavioural parameter set </w:t>
+        <w:t xml:space="preserve">For each </w:t>
+      </w:r>
+      <w:proofErr w:type="spellStart"/>
+      <w:r>
+        <w:t>behavioural</w:t>
+      </w:r>
+      <w:proofErr w:type="spellEnd"/>
+      <w:r>
+        <w:t xml:space="preserve"> parameter set </w:t>
       </w:r>
       <m:oMath>
         <m:r>
@@ -9344,7 +10186,15 @@
         </m:sSub>
       </m:oMath>
       <w:r>
-        <w:t xml:space="preserve"> is the number of behavioural parameter sets. This quantity represents the GLUE-weighted probability that node </w:t>
+        <w:t xml:space="preserve"> is the number of behavioural </w:t>
+      </w:r>
+      <w:proofErr w:type="gramStart"/>
+      <w:r>
+        <w:t>parameter</w:t>
+      </w:r>
+      <w:proofErr w:type="gramEnd"/>
+      <w:r>
+        <w:t xml:space="preserve"> sets. This quantity represents the GLUE-weighted probability that node </w:t>
       </w:r>
       <m:oMath>
         <m:r>
@@ -9950,7 +10800,15 @@
     <w:p/>
     <w:p>
       <w:r>
-        <w:t xml:space="preserve">The resulting value P_n was interpreted as the time-averaged probability that node n falls below the chlorine threshold under the calibrated GLUE wall-decay uncertainty. Nodes with </w:t>
+        <w:t xml:space="preserve">The resulting value </w:t>
+      </w:r>
+      <w:proofErr w:type="spellStart"/>
+      <w:r>
+        <w:t>P_n</w:t>
+      </w:r>
+      <w:proofErr w:type="spellEnd"/>
+      <w:r>
+        <w:t xml:space="preserve"> was interpreted as the time-averaged probability that node n falls below the chlorine threshold under the calibrated GLUE wall-decay uncertainty. Nodes with </w:t>
       </w:r>
       <m:oMath>
         <m:sSub>
@@ -10017,17 +10875,73 @@
     </w:p>
     <w:p>
       <w:r>
-        <w:t xml:space="preserve">For the network-level time series reported in the Results, the same ensemble indicator was aggregated across junctions at each time step. Let N be the number of junction nodes and let P_n(t) be the behavioural-ensemble probability that node n is below C_min at time t. The network fraction of nodes below threshold was defined as F(t) = </w:t>
+        <w:t xml:space="preserve">For the network-level time series reported in the Results, the same ensemble indicator was aggregated across junctions at each time step. Let N be the number of junction nodes and let </w:t>
+      </w:r>
+      <w:proofErr w:type="spellStart"/>
+      <w:r>
+        <w:t>P_n</w:t>
+      </w:r>
+      <w:proofErr w:type="spellEnd"/>
+      <w:r>
+        <w:t xml:space="preserve">(t) be the </w:t>
+      </w:r>
+      <w:proofErr w:type="spellStart"/>
+      <w:r>
+        <w:t>behavioural</w:t>
+      </w:r>
+      <w:proofErr w:type="spellEnd"/>
+      <w:r>
+        <w:t xml:space="preserve">-ensemble probability that node n is below </w:t>
+      </w:r>
+      <w:proofErr w:type="spellStart"/>
+      <w:r>
+        <w:t>C_min</w:t>
+      </w:r>
+      <w:proofErr w:type="spellEnd"/>
+      <w:r>
+        <w:t xml:space="preserve"> at time t. The network fraction of nodes below threshold was defined as F(t) = </w:t>
       </w:r>
       <w:r>
         <w:lastRenderedPageBreak/>
-        <w:t>(1/N) · Σ_n P_n(t). Equivalently, F(t) is the ensemble-mean fraction of junctions with simulated residual chlorine below C_min at time t under the calibrated wall-decay uncertainty.</w:t>
-      </w:r>
-    </w:p>
-    <w:p/>
-    <w:p>
-      <w:r>
-        <w:t>The threshold-risk calculation was applied to all junction nodes in the Net3 network, not only to the monitoring nodes used during calibration. This allowed the calibrated uncertainty to be translated into a network-wide low-chlorine risk map. Risk estimates at unmonitored nodes should therefore be interpreted as model-predicted risks derived from the WNTR/EPANET simulation and the GLUE behavioural ensemble, rather than as directly observed risks.</w:t>
+        <w:t xml:space="preserve">(1/N) · </w:t>
+      </w:r>
+      <w:proofErr w:type="spellStart"/>
+      <w:r>
+        <w:t>Σ_n</w:t>
+      </w:r>
+      <w:proofErr w:type="spellEnd"/>
+      <w:r>
+        <w:t xml:space="preserve"> </w:t>
+      </w:r>
+      <w:proofErr w:type="spellStart"/>
+      <w:r>
+        <w:t>P_n</w:t>
+      </w:r>
+      <w:proofErr w:type="spellEnd"/>
+      <w:r>
+        <w:t xml:space="preserve">(t). Equivalently, F(t) is the ensemble-mean fraction of junctions with simulated residual chlorine below </w:t>
+      </w:r>
+      <w:proofErr w:type="spellStart"/>
+      <w:r>
+        <w:t>C_min</w:t>
+      </w:r>
+      <w:proofErr w:type="spellEnd"/>
+      <w:r>
+        <w:t xml:space="preserve"> at time t under the calibrated wall-decay uncertainty.</w:t>
+      </w:r>
+    </w:p>
+    <w:p/>
+    <w:p>
+      <w:r>
+        <w:t xml:space="preserve">The threshold-risk calculation was applied to all junction nodes in the Net3 network, not only to the monitoring nodes used during calibration. This allowed the calibrated uncertainty to be translated into a network-wide low-chlorine risk map. Risk estimates at unmonitored nodes should therefore be interpreted as model-predicted risks derived from the WNTR/EPANET simulation and the GLUE </w:t>
+      </w:r>
+      <w:proofErr w:type="spellStart"/>
+      <w:r>
+        <w:t>behavioural</w:t>
+      </w:r>
+      <w:proofErr w:type="spellEnd"/>
+      <w:r>
+        <w:t xml:space="preserve"> ensemble, rather than as directly observed risks.</w:t>
       </w:r>
     </w:p>
     <w:p/>
@@ -10294,7 +11208,15 @@
     </w:p>
     <w:p>
       <w:r>
-        <w:t>Independent Gaussian noise with standard deviation sigma = 0.1 mg/L was added to the true chlorine time series at the six monitoring nodes. Across all monitored samples the realised noise RMSE was 0.092 mg/L, consistent with the specified level, and 28 of the 438 hourly observations across the full 72 h simulation (including the 24 h warm-up window) were clipped to zero because the added noise would otherwise have produced physically impossible negative concentrations at the lowest-concentration points. Inverse calibration and GLUE used only the post-warm-up portion of these noisy series.</w:t>
+        <w:t xml:space="preserve">Independent Gaussian noise with standard deviation sigma = 0.1 mg/L was added to the true chlorine time series at the six monitoring nodes. Across all monitored samples the </w:t>
+      </w:r>
+      <w:proofErr w:type="spellStart"/>
+      <w:r>
+        <w:t>realised</w:t>
+      </w:r>
+      <w:proofErr w:type="spellEnd"/>
+      <w:r>
+        <w:t xml:space="preserve"> noise RMSE was 0.092 mg/L, consistent with the specified level, and 28 of the 438 hourly observations across the full 72 h simulation (including the 24 h warm-up window) were clipped to zero because the added noise would otherwise have produced physically impossible negative concentrations at the lowest-concentration points. Inverse calibration and GLUE used only the post-warm-up portion of these noisy series.</w:t>
       </w:r>
     </w:p>
     <w:p/>
@@ -10321,7 +11243,23 @@
     </w:p>
     <w:p>
       <w:r>
-        <w:t>As a supplementary check, a single effective (lumped) first-order decay coefficient was estimated from noisy observations at three assumed noise levels, using 200 independent Monte Carlo noise realisations at each level. As the sensor-error standard deviation increased from sigma = 0.02 to 0.05 and 0.10 mg/L, the standard deviation of the estimated coefficient across realisations rose from 0.030 to 0.052 and 0.087 day⁻¹, while the mean estimate stayed almost constant (-1.147, -1.138 and -1.143 day⁻¹). Observation noise therefore mainly widens the spread of the estimate rather than biasing it. The lumped coefficient is an effective one-parameter fit (day⁻¹) to a spatially heterogeneous wall-decay field and is not directly comparable to the three grouped wall coefficients (m day⁻¹); any persistent offset from those grouped values is therefore expected under this simplification. The check supports representing measurement uncertainty explicitly rather than relying on a single best-fit coefficient, but it does not replace the three-zone wall calibration.</w:t>
+        <w:t xml:space="preserve">As a supplementary check, a single effective (lumped) first-order decay coefficient was estimated from noisy observations at three assumed noise levels, using 200 independent Monte Carlo noise </w:t>
+      </w:r>
+      <w:proofErr w:type="spellStart"/>
+      <w:r>
+        <w:t>realisations</w:t>
+      </w:r>
+      <w:proofErr w:type="spellEnd"/>
+      <w:r>
+        <w:t xml:space="preserve"> at each level. As the sensor-error standard deviation increased from sigma = 0.02 to 0.05 and 0.10 mg/L, the standard deviation of the estimated coefficient across </w:t>
+      </w:r>
+      <w:proofErr w:type="spellStart"/>
+      <w:r>
+        <w:t>realisations</w:t>
+      </w:r>
+      <w:proofErr w:type="spellEnd"/>
+      <w:r>
+        <w:t xml:space="preserve"> rose from 0.030 to 0.052 and 0.087 day⁻¹, while the mean estimate stayed almost constant (-1.147, -1.138 and -1.143 day⁻¹). Observation noise therefore mainly widens the spread of the estimate rather than biasing it. The lumped coefficient is an effective one-parameter fit (day⁻¹) to a spatially heterogeneous wall-decay field and is not directly comparable to the three grouped wall coefficients (m day⁻¹); any persistent offset from those grouped values is therefore expected under this simplification. The check supports representing measurement uncertainty explicitly rather than relying on a single best-fit coefficient, but it does not replace the three-zone wall calibration.</w:t>
       </w:r>
     </w:p>
     <w:p>
@@ -10379,7 +11317,21 @@
         <w:rPr>
           <w:i/>
         </w:rPr>
-        <w:t>Figure. Measurement-noise sensitivity: estimated effective first-order decay coefficient over 200 Monte Carlo realisations at sigma = 0.02, 0.05 and 0.10 mg/L (left), and the near-linear scaling of estimate width with sensor noise (right).</w:t>
+        <w:t xml:space="preserve">Figure. Measurement-noise sensitivity: estimated effective first-order decay coefficient over 200 Monte Carlo </w:t>
+      </w:r>
+      <w:proofErr w:type="spellStart"/>
+      <w:r>
+        <w:rPr>
+          <w:i/>
+        </w:rPr>
+        <w:t>realisations</w:t>
+      </w:r>
+      <w:proofErr w:type="spellEnd"/>
+      <w:r>
+        <w:rPr>
+          <w:i/>
+        </w:rPr>
+        <w:t xml:space="preserve"> at sigma = 0.02, 0.05 and 0.10 mg/L (left), and the near-linear scaling of estimate width with sensor noise (right).</w:t>
       </w:r>
     </w:p>
     <w:bookmarkEnd w:id="0"/>
@@ -10403,7 +11355,54 @@
     </w:p>
     <w:p>
       <w:r>
-        <w:t>The deterministic grid search approximately recovered the imposed grouped wall-decay coefficients. Under the baseline noise level (sigma = 0.1 mg/L), the minimum-RMSE parameter vector was (k_w,old, k_w,average, k_w,new) = (-1.07, -0.09, -0.05) m/day, compared with the true values (-1.0, -0.1, -0.05) m/day; each estimate fell on the grid node nearest its true value. This confirms that the forward simulator, the synthetic-observation generation and the RMSE objective are implemented consistently and that the imposed behaviour is recoverable in principle.</w:t>
+        <w:t>The deterministic grid search approximately recovered the imposed grouped wall-decay coefficients. Under the baseline noise level (sigma = 0.1 mg/L), the minimum-RMSE parameter vector was (</w:t>
+      </w:r>
+      <w:proofErr w:type="spellStart"/>
+      <w:r>
+        <w:t>k_</w:t>
+      </w:r>
+      <w:proofErr w:type="gramStart"/>
+      <w:r>
+        <w:t>w,old</w:t>
+      </w:r>
+      <w:proofErr w:type="spellEnd"/>
+      <w:proofErr w:type="gramEnd"/>
+      <w:r>
+        <w:t xml:space="preserve">, </w:t>
+      </w:r>
+      <w:proofErr w:type="spellStart"/>
+      <w:r>
+        <w:t>k_</w:t>
+      </w:r>
+      <w:proofErr w:type="gramStart"/>
+      <w:r>
+        <w:t>w,average</w:t>
+      </w:r>
+      <w:proofErr w:type="spellEnd"/>
+      <w:proofErr w:type="gramEnd"/>
+      <w:r>
+        <w:t xml:space="preserve">, </w:t>
+      </w:r>
+      <w:proofErr w:type="spellStart"/>
+      <w:r>
+        <w:t>k_</w:t>
+      </w:r>
+      <w:proofErr w:type="gramStart"/>
+      <w:r>
+        <w:t>w,new</w:t>
+      </w:r>
+      <w:proofErr w:type="spellEnd"/>
+      <w:proofErr w:type="gramEnd"/>
+      <w:r>
+        <w:t xml:space="preserve">) = (-1.07, -0.09, -0.05) m/day, compared with the true values (-1.0, -0.1, -0.05) m/day; each estimate fell on the grid node nearest its true value. This confirms that the forward simulator, the synthetic-observation generation and the RMSE objective are implemented consistently and that the imposed </w:t>
+      </w:r>
+      <w:proofErr w:type="spellStart"/>
+      <w:r>
+        <w:t>behaviour</w:t>
+      </w:r>
+      <w:proofErr w:type="spellEnd"/>
+      <w:r>
+        <w:t xml:space="preserve"> is recoverable in principle.</w:t>
       </w:r>
     </w:p>
     <w:p>
@@ -10464,11 +11463,71 @@
     </w:p>
     <w:p>
       <w:r>
-        <w:t xml:space="preserve">Repeating the full forward-noise-inverse experiment over ten independent noise realisations quantified the reliability of this point estimate. The recovered coefficients </w:t>
+        <w:t xml:space="preserve">Repeating the full forward-noise-inverse experiment over ten independent noise </w:t>
+      </w:r>
+      <w:proofErr w:type="spellStart"/>
+      <w:r>
+        <w:t>realisations</w:t>
+      </w:r>
+      <w:proofErr w:type="spellEnd"/>
+      <w:r>
+        <w:t xml:space="preserve"> quantified the reliability of this point estimate. The recovered coefficients </w:t>
       </w:r>
       <w:r>
         <w:lastRenderedPageBreak/>
-        <w:t>were k_w,old = -1.05 +/- 0.12, k_w,average = -0.101 +/- 0.012 and k_w,new = -0.051 +/- 0.008 m/day (mean +/- standard deviation). All three means lie within one grid step of the truth, but the spread is markedly largest for k_w,old, giving an early indication that this parameter, although physically dominant, is the least reliably identified.</w:t>
+        <w:t xml:space="preserve">were </w:t>
+      </w:r>
+      <w:proofErr w:type="spellStart"/>
+      <w:r>
+        <w:t>k_</w:t>
+      </w:r>
+      <w:proofErr w:type="gramStart"/>
+      <w:r>
+        <w:t>w,old</w:t>
+      </w:r>
+      <w:proofErr w:type="spellEnd"/>
+      <w:proofErr w:type="gramEnd"/>
+      <w:r>
+        <w:t xml:space="preserve"> = -1.05 +/- 0.12, </w:t>
+      </w:r>
+      <w:proofErr w:type="spellStart"/>
+      <w:r>
+        <w:t>k_</w:t>
+      </w:r>
+      <w:proofErr w:type="gramStart"/>
+      <w:r>
+        <w:t>w,average</w:t>
+      </w:r>
+      <w:proofErr w:type="spellEnd"/>
+      <w:proofErr w:type="gramEnd"/>
+      <w:r>
+        <w:t xml:space="preserve"> = -0.101 +/- 0.012 and </w:t>
+      </w:r>
+      <w:proofErr w:type="spellStart"/>
+      <w:r>
+        <w:t>k_</w:t>
+      </w:r>
+      <w:proofErr w:type="gramStart"/>
+      <w:r>
+        <w:t>w,new</w:t>
+      </w:r>
+      <w:proofErr w:type="spellEnd"/>
+      <w:proofErr w:type="gramEnd"/>
+      <w:r>
+        <w:t xml:space="preserve"> = -0.051 +/- 0.008 m/day (mean +/- standard deviation). All three means lie within one grid step of the truth, but the spread is markedly largest for </w:t>
+      </w:r>
+      <w:proofErr w:type="spellStart"/>
+      <w:r>
+        <w:t>k_</w:t>
+      </w:r>
+      <w:proofErr w:type="gramStart"/>
+      <w:r>
+        <w:t>w,old</w:t>
+      </w:r>
+      <w:proofErr w:type="spellEnd"/>
+      <w:proofErr w:type="gramEnd"/>
+      <w:r>
+        <w:t>, giving an early indication that this parameter, although physically dominant, is the least reliably identified.</w:t>
       </w:r>
     </w:p>
     <w:p>
@@ -10524,7 +11583,21 @@
         <w:rPr>
           <w:i/>
         </w:rPr>
-        <w:t>Figure. Recovered coefficients over ten noise realisations against the true values.</w:t>
+        <w:t xml:space="preserve">Figure. Recovered coefficients over ten noise </w:t>
+      </w:r>
+      <w:proofErr w:type="spellStart"/>
+      <w:r>
+        <w:rPr>
+          <w:i/>
+        </w:rPr>
+        <w:t>realisations</w:t>
+      </w:r>
+      <w:proofErr w:type="spellEnd"/>
+      <w:r>
+        <w:rPr>
+          <w:i/>
+        </w:rPr>
+        <w:t xml:space="preserve"> against the true values.</w:t>
       </w:r>
     </w:p>
     <w:p>
@@ -10536,28 +11609,168 @@
         </w:numPr>
       </w:pPr>
       <w:r>
-        <w:t>GLUE behavioural ensemble and parameter uncertainty</w:t>
-      </w:r>
-    </w:p>
-    <w:p>
-      <w:r>
-        <w:t>Of the 2000 parameter sets sampled from the uniform priors, 1685 were retained as behavioural (RMSE &lt; 0.12 mg/L), with a minimum RMSE of 0.098 mg/L, close to the measurement-noise floor under the baseline observation uncertainty. The large behavioural fraction indicates that the three-parameter wall-decay space remains only weakly constrained by the six monitoring nodes: many dissimilar coefficient combinations still reproduce the noisy observations within the behavioural threshold. The likelihood-weighted behavioural distributions were k_w,old = -0.96 +/- 0.32, k_w,average = -0.12 +/- 0.045 and k_w,new = -0.053 +/- 0.027 m/day, reported as weighted mean +/- weighted standard deviation. The weighted mean of every group lies close to its true value, but the widths differ greatly.</w:t>
-      </w:r>
-    </w:p>
-    <w:p/>
-    <w:p>
-      <w:r>
-        <w:t xml:space="preserve">The small differences between the weighted means and the imposed true values should not be interpreted as deterministic calibration bias. In the GLUE framework, the weighted mean is the centre of the retained behavioural ensemble under the chosen likelihood weighting, rather than a parameter value that is required to coincide with the synthetic truth. Because the calibration uses noisy observations and because different </w:t>
+        <w:t xml:space="preserve">GLUE </w:t>
+      </w:r>
+      <w:proofErr w:type="spellStart"/>
+      <w:r>
+        <w:t>behavioural</w:t>
+      </w:r>
+      <w:proofErr w:type="spellEnd"/>
+      <w:r>
+        <w:t xml:space="preserve"> ensemble and parameter uncertainty</w:t>
+      </w:r>
+    </w:p>
+    <w:p>
+      <w:r>
+        <w:t xml:space="preserve">Of the 2000 parameter sets sampled from the uniform priors, 1685 were retained as </w:t>
+      </w:r>
+      <w:proofErr w:type="spellStart"/>
+      <w:r>
+        <w:t>behavioural</w:t>
+      </w:r>
+      <w:proofErr w:type="spellEnd"/>
+      <w:r>
+        <w:t xml:space="preserve"> (RMSE &lt; 0.12 mg/L), with a minimum RMSE of 0.098 mg/L, close to the measurement-noise floor under the baseline observation uncertainty. The large </w:t>
+      </w:r>
+      <w:proofErr w:type="spellStart"/>
+      <w:r>
+        <w:t>behavioural</w:t>
+      </w:r>
+      <w:proofErr w:type="spellEnd"/>
+      <w:r>
+        <w:t xml:space="preserve"> fraction indicates that the three-parameter wall-decay space remains only weakly constrained by the six monitoring nodes: many dissimilar coefficient combinations still reproduce the noisy observations within the </w:t>
+      </w:r>
+      <w:proofErr w:type="spellStart"/>
+      <w:r>
+        <w:t>behavioural</w:t>
+      </w:r>
+      <w:proofErr w:type="spellEnd"/>
+      <w:r>
+        <w:t xml:space="preserve"> threshold. </w:t>
+      </w:r>
+      <w:bookmarkStart w:id="1" w:name="OLE_LINK5"/>
+      <w:r>
+        <w:t xml:space="preserve">The likelihood-weighted </w:t>
+      </w:r>
+      <w:proofErr w:type="spellStart"/>
+      <w:r>
+        <w:t>behavioural</w:t>
+      </w:r>
+      <w:proofErr w:type="spellEnd"/>
+      <w:r>
+        <w:t xml:space="preserve"> distributions were </w:t>
+      </w:r>
+      <w:proofErr w:type="spellStart"/>
+      <w:r>
+        <w:t>k_</w:t>
+      </w:r>
+      <w:proofErr w:type="gramStart"/>
+      <w:r>
+        <w:t>w,old</w:t>
+      </w:r>
+      <w:proofErr w:type="spellEnd"/>
+      <w:proofErr w:type="gramEnd"/>
+      <w:r>
+        <w:t xml:space="preserve"> = -0.96 +/- 0.32, </w:t>
+      </w:r>
+      <w:proofErr w:type="spellStart"/>
+      <w:r>
+        <w:t>k_</w:t>
+      </w:r>
+      <w:proofErr w:type="gramStart"/>
+      <w:r>
+        <w:t>w,average</w:t>
+      </w:r>
+      <w:proofErr w:type="spellEnd"/>
+      <w:proofErr w:type="gramEnd"/>
+      <w:r>
+        <w:t xml:space="preserve"> = -0.12 +/- 0.045 and </w:t>
+      </w:r>
+      <w:proofErr w:type="spellStart"/>
+      <w:r>
+        <w:t>k_</w:t>
+      </w:r>
+      <w:proofErr w:type="gramStart"/>
+      <w:r>
+        <w:t>w,new</w:t>
+      </w:r>
+      <w:proofErr w:type="spellEnd"/>
+      <w:proofErr w:type="gramEnd"/>
+      <w:r>
+        <w:t xml:space="preserve"> = -0.053 +/- 0.027 m/day, reported as weighted mean +/- weighted standard deviation. The weighted mean of every group lies close to its true value, but the widths differ greatly.</w:t>
+      </w:r>
+      <w:bookmarkEnd w:id="1"/>
+    </w:p>
+    <w:p/>
+    <w:p>
+      <w:r>
+        <w:t xml:space="preserve">The small differences between the weighted means and the imposed true values should not be interpreted as deterministic calibration bias. In the GLUE framework, the weighted mean is the </w:t>
+      </w:r>
+      <w:proofErr w:type="spellStart"/>
+      <w:r>
+        <w:t>centre</w:t>
+      </w:r>
+      <w:proofErr w:type="spellEnd"/>
+      <w:r>
+        <w:t xml:space="preserve"> of the retained </w:t>
+      </w:r>
+      <w:proofErr w:type="spellStart"/>
+      <w:r>
+        <w:t>behavioural</w:t>
+      </w:r>
+      <w:proofErr w:type="spellEnd"/>
+      <w:r>
+        <w:t xml:space="preserve"> ensemble under the chosen likelihood weighting, rather than a parameter value that is required to coincide with the synthetic truth. Because the calibration uses noisy observations and because different </w:t>
       </w:r>
       <w:r>
         <w:lastRenderedPageBreak/>
-        <w:t>grouped wall reaction coefficients can partially compensate for each other, the behavioural mean may shift away from the imposed value even when the true value remains within the plausible behavioural range. The magnitude of this shift is therefore interpreted together with the width of the behavioural distribution: a close mean does not imply strong identifiability when the distribution remains broad (as for the new-group coefficient), and a small displacement from the true value does not indicate calibration failure when that displacement is much smaller than the behavioural uncertainty (as for the old-group coefficient).</w:t>
-      </w:r>
-    </w:p>
-    <w:p/>
-    <w:p>
-      <w:r>
-        <w:t>This reveals a clear identifiability gradient that a single best-fit estimate conceals. The old-group coefficient carries by far the largest GLUE-weighted uncertainty (about +/-0.32 m/day): although it governs the strongest chlorine loss in the network, it acts in the eastern zone where residual is already low, sensitivity is small and relative measurement noise is largest, and it is informed by only two monitoring nodes. At the opposite extreme, the behavioural distribution of the new-group coefficient (+/-0.027 m/day) is essentially indistinguishable from its uniform prior, i.e. the observations carry almost no information about it, because the low-reactivity western zone lies near the source where wall decay has a negligible effect on residual. The average-group coefficient is only weakly constrained. The value of the uncertainty-aware formulation is precisely that it exposes which parameters are informed by the data and which are not, information hidden by the near-perfect deterministic fit.</w:t>
+        <w:t xml:space="preserve">grouped wall reaction coefficients can partially compensate for each other, the </w:t>
+      </w:r>
+      <w:proofErr w:type="spellStart"/>
+      <w:r>
+        <w:t>behavioural</w:t>
+      </w:r>
+      <w:proofErr w:type="spellEnd"/>
+      <w:r>
+        <w:t xml:space="preserve"> mean may shift away from the imposed value even when the true value remains within the plausible </w:t>
+      </w:r>
+      <w:proofErr w:type="spellStart"/>
+      <w:r>
+        <w:t>behavioural</w:t>
+      </w:r>
+      <w:proofErr w:type="spellEnd"/>
+      <w:r>
+        <w:t xml:space="preserve"> range. The magnitude of this shift is therefore interpreted together with the width of the </w:t>
+      </w:r>
+      <w:proofErr w:type="spellStart"/>
+      <w:r>
+        <w:t>behavioural</w:t>
+      </w:r>
+      <w:proofErr w:type="spellEnd"/>
+      <w:r>
+        <w:t xml:space="preserve"> distribution: a close mean does not imply strong identifiability when the distribution remains broad (as for the new-group coefficient), and a small displacement from the true value does not indicate calibration failure when that displacement is much smaller than the </w:t>
+      </w:r>
+      <w:proofErr w:type="spellStart"/>
+      <w:r>
+        <w:t>behavioural</w:t>
+      </w:r>
+      <w:proofErr w:type="spellEnd"/>
+      <w:r>
+        <w:t xml:space="preserve"> uncertainty (as for the old-group coefficient).</w:t>
+      </w:r>
+    </w:p>
+    <w:p/>
+    <w:p>
+      <w:r>
+        <w:t xml:space="preserve">This reveals a clear identifiability gradient that a single best-fit estimate conceals. The old-group coefficient carries by far the largest GLUE-weighted uncertainty (about +/-0.32 m/day): although it governs the strongest chlorine loss in the network, it acts in the eastern zone where residual is already low, sensitivity is small and relative measurement noise is largest, and it is informed by only two monitoring nodes. At the opposite extreme, the </w:t>
+      </w:r>
+      <w:proofErr w:type="spellStart"/>
+      <w:r>
+        <w:t>behavioural</w:t>
+      </w:r>
+      <w:proofErr w:type="spellEnd"/>
+      <w:r>
+        <w:t xml:space="preserve"> distribution of the new-group coefficient (+/-0.027 m/day) is essentially indistinguishable from its uniform prior, i.e. the observations carry almost no information about it, because the low-reactivity western zone lies near the source where wall decay has a negligible effect on residual. The average-group coefficient is only weakly constrained. The value of the uncertainty-aware formulation is precisely that it exposes which parameters are informed by the data and which are not, information hidden by the near-perfect deterministic fit.</w:t>
       </w:r>
     </w:p>
     <w:p>
@@ -10613,7 +11826,21 @@
         <w:rPr>
           <w:i/>
         </w:rPr>
-        <w:t>Figure. GLUE-weighted behavioural distributions of the three grouped wall reaction coefficients (prior range and true value shown).</w:t>
+        <w:t xml:space="preserve">Figure. GLUE-weighted </w:t>
+      </w:r>
+      <w:proofErr w:type="spellStart"/>
+      <w:r>
+        <w:rPr>
+          <w:i/>
+        </w:rPr>
+        <w:t>behavioural</w:t>
+      </w:r>
+      <w:proofErr w:type="spellEnd"/>
+      <w:r>
+        <w:rPr>
+          <w:i/>
+        </w:rPr>
+        <w:t xml:space="preserve"> distributions of the three grouped wall reaction coefficients (prior range and true value shown).</w:t>
       </w:r>
     </w:p>
     <w:p>
@@ -10631,13 +11858,29 @@
     <w:p>
       <w:r>
         <w:lastRenderedPageBreak/>
-        <w:t>Propagating the behavioural ensemble forward produced, at each node, a 5th-95th-percentile GLUE predictive band rather than a single trajectory. At both a near-source and a downstream node the weighted-median prediction tracked the underlying truth. The band represents uncertainty in the calibrated grouped wall reaction coefficients only; it does not include an explicit observation-noise envelope, so noisy synthetic observations are not expected to lie entirely inside the 5-95% parameter-uncertainty band.</w:t>
-      </w:r>
-    </w:p>
-    <w:p/>
-    <w:p>
-      <w:r>
-        <w:t>The width of the predictive band, however, varied strongly with location and mirrored the identifiability gradient described above. Averaged over the post-warm-up window, the 5-95% band was about 0.08 mg/L at node 107 (new zone, near source) but about 0.14 mg/L at node 15 (old zone, downstream), roughly 1.7 times wider. Node 15 lies in the zone governed by the weakly-identified old-group coefficient, so parameter uncertainty propagates into a substantially wider prediction, whereas node 107 lies where residual is insensitive to wall decay and its prediction is tight regardless of parameter uncertainty. Predictive confidence is therefore spatially non-uniform, and is lowest precisely in the low-residual locations that matter most for operational threshold-risk interpretation.</w:t>
+        <w:t xml:space="preserve">Propagating the </w:t>
+      </w:r>
+      <w:proofErr w:type="spellStart"/>
+      <w:r>
+        <w:t>behavioural</w:t>
+      </w:r>
+      <w:proofErr w:type="spellEnd"/>
+      <w:r>
+        <w:t xml:space="preserve"> ensemble forward produced, at each node, a 5th-95th-percentile GLUE predictive band rather than a single trajectory. At both a near-source and a downstream node the weighted-median prediction tracked the underlying truth. The band represents uncertainty in the calibrated grouped wall reaction coefficients only; it does not include an explicit observation-noise envelope, so noisy synthetic observations are not expected to lie entirely inside the 5-95% parameter-uncertainty band.</w:t>
+      </w:r>
+    </w:p>
+    <w:p/>
+    <w:p>
+      <w:r>
+        <w:t>The width of the predictive band, however, varied strongly with location and mirrored the identifiability gradient described above. Averaged over the post-warm-up window, the 5-95% band was about 0.08 mg/L at node 107 (new zone, near source) but about 0.14 mg/L at node 15 (old zone, downstream), roughly 1.7 times wider. Node 15 lies in the zone governed by the weakly-identified old-group coefficient, so parameter uncertainty propagates into a substantially wider prediction, whereas node 107 lies where residual is insensitive to wall decay and its prediction is tight regardless of parameter uncertainty. Predictive confidence is therefore spatially non-</w:t>
+      </w:r>
+      <w:proofErr w:type="gramStart"/>
+      <w:r>
+        <w:t>uniform, and</w:t>
+      </w:r>
+      <w:proofErr w:type="gramEnd"/>
+      <w:r>
+        <w:t xml:space="preserve"> is lowest precisely in the low-residual locations that matter most for operational threshold-risk interpretation.</w:t>
       </w:r>
     </w:p>
     <w:p>
@@ -10767,7 +12010,31 @@
     </w:p>
     <w:p>
       <w:r>
-        <w:t>The behavioural ensemble was propagated to all 92 network junctions to estimate the time-averaged probability that residual chlorine falls below the C_min = 0.2 mg/L threshold. Under the GLUE weighting, 25 of the 92 junctions had a non-zero time-averaged below-threshold probability. The highest-risk locations were concentrated in the eastern old-pipe zone and the distal dead-ends: node 131 had the highest risk (P_n ≈ 0.96), followed by nodes 243 (0.70), 141 (0.44), 139 (0.42), 15 (0.38) and 143 (0.35), whereas the near-source new-zone nodes carried essentially zero risk.</w:t>
+        <w:t xml:space="preserve">The </w:t>
+      </w:r>
+      <w:proofErr w:type="spellStart"/>
+      <w:r>
+        <w:t>behavioural</w:t>
+      </w:r>
+      <w:proofErr w:type="spellEnd"/>
+      <w:r>
+        <w:t xml:space="preserve"> ensemble was propagated to all 92 network junctions to estimate the time-averaged probability that residual chlorine falls below the </w:t>
+      </w:r>
+      <w:proofErr w:type="spellStart"/>
+      <w:r>
+        <w:t>C_min</w:t>
+      </w:r>
+      <w:proofErr w:type="spellEnd"/>
+      <w:r>
+        <w:t xml:space="preserve"> = 0.2 mg/L threshold. Under the GLUE weighting, 25 of the 92 junctions had a non-zero time-averaged below-threshold probability. The highest-risk locations were concentrated in the eastern old-pipe zone and the distal dead-ends: node 131 had the highest risk (</w:t>
+      </w:r>
+      <w:proofErr w:type="spellStart"/>
+      <w:r>
+        <w:t>P_n</w:t>
+      </w:r>
+      <w:proofErr w:type="spellEnd"/>
+      <w:r>
+        <w:t xml:space="preserve"> ≈ 0.96), followed by nodes 243 (0.70), 141 (0.44), 139 (0.42), 15 (0.38) and 143 (0.35), whereas the near-source new-zone nodes carried essentially zero risk.</w:t>
       </w:r>
     </w:p>
     <w:p>
@@ -10824,7 +12091,21 @@
         <w:rPr>
           <w:i/>
         </w:rPr>
-        <w:t>Figure. GLUE-weighted network risk map, P(C &lt; 0.2 mg/L).</w:t>
+        <w:t xml:space="preserve">Figure. GLUE-weighted network risk map, </w:t>
+      </w:r>
+      <w:proofErr w:type="gramStart"/>
+      <w:r>
+        <w:rPr>
+          <w:i/>
+        </w:rPr>
+        <w:t>P(</w:t>
+      </w:r>
+      <w:proofErr w:type="gramEnd"/>
+      <w:r>
+        <w:rPr>
+          <w:i/>
+        </w:rPr>
+        <w:t>C &lt; 0.2 mg/L).</w:t>
       </w:r>
     </w:p>
     <w:p>
@@ -10897,12 +12178,12 @@
           <w:numId w:val="1"/>
         </w:numPr>
       </w:pPr>
-      <w:bookmarkStart w:id="1" w:name="OLE_LINK1"/>
+      <w:bookmarkStart w:id="2" w:name="OLE_LINK1"/>
       <w:r>
         <w:t>Sensitivity to pipe-group spatial arrangement</w:t>
       </w:r>
     </w:p>
-    <w:bookmarkEnd w:id="1"/>
+    <w:bookmarkEnd w:id="2"/>
     <w:p>
       <w:r>
         <w:t>To test how the imposed pipe-group arrangement affects the calibration, the experiment was repeated with the three reactivity classes interleaved across the network (assigned cyclically along the pipe list) rather than grouped into contiguous zones. This produced an equal split of 39 old, 39 average and 39 new pipes, with high-decay old pipes distributed throughout the network rather than concentrated in the east.</w:t>
@@ -10961,7 +12242,86 @@
     </w:p>
     <w:p>
       <w:r>
-        <w:t>Under this arrangement every monitoring node showed a clear reduction relative to the all-new baseline, so the low-residual behaviour was no longer confined to one zone. The GLUE calibration retained 1388 of 2000 sets as behavioural (minimum RMSE 0.097 mg/L), with behavioural distributions k_w,old = -1.04 +/- 0.26, k_w,average = -0.12 +/- 0.045 and k_w,new = -0.053 +/- 0.027 m/day. Notably, the dominant old-group coefficient was better identified than in the zoned case (its behavioural distribution narrowed to about 69% of the prior width, versus about 85% when the old pipes were concentrated), because old pipes now lie on the paths to several sensors so more observations carry information about it.</w:t>
+        <w:t xml:space="preserve">Under this arrangement every monitoring node showed a clear reduction relative to the all-new baseline, so the low-residual </w:t>
+      </w:r>
+      <w:proofErr w:type="spellStart"/>
+      <w:r>
+        <w:t>behaviour</w:t>
+      </w:r>
+      <w:proofErr w:type="spellEnd"/>
+      <w:r>
+        <w:t xml:space="preserve"> was no longer confined to one zone. The GLUE calibration retained 1388 of 2000 sets as </w:t>
+      </w:r>
+      <w:proofErr w:type="spellStart"/>
+      <w:r>
+        <w:t>behavioural</w:t>
+      </w:r>
+      <w:proofErr w:type="spellEnd"/>
+      <w:r>
+        <w:t xml:space="preserve"> (minimum RMSE 0.097 mg/L), with </w:t>
+      </w:r>
+      <w:proofErr w:type="spellStart"/>
+      <w:r>
+        <w:t>behavioural</w:t>
+      </w:r>
+      <w:proofErr w:type="spellEnd"/>
+      <w:r>
+        <w:t xml:space="preserve"> distributions </w:t>
+      </w:r>
+      <w:proofErr w:type="spellStart"/>
+      <w:r>
+        <w:t>k_</w:t>
+      </w:r>
+      <w:proofErr w:type="gramStart"/>
+      <w:r>
+        <w:t>w,old</w:t>
+      </w:r>
+      <w:proofErr w:type="spellEnd"/>
+      <w:proofErr w:type="gramEnd"/>
+      <w:r>
+        <w:t xml:space="preserve"> = -1.04 +/- 0.26, </w:t>
+      </w:r>
+      <w:proofErr w:type="spellStart"/>
+      <w:r>
+        <w:t>k_</w:t>
+      </w:r>
+      <w:proofErr w:type="gramStart"/>
+      <w:r>
+        <w:t>w,average</w:t>
+      </w:r>
+      <w:proofErr w:type="spellEnd"/>
+      <w:proofErr w:type="gramEnd"/>
+      <w:r>
+        <w:t xml:space="preserve"> = -0.12 +/- 0.045 and </w:t>
+      </w:r>
+      <w:proofErr w:type="spellStart"/>
+      <w:r>
+        <w:t>k_</w:t>
+      </w:r>
+      <w:proofErr w:type="gramStart"/>
+      <w:r>
+        <w:t>w,new</w:t>
+      </w:r>
+      <w:proofErr w:type="spellEnd"/>
+      <w:proofErr w:type="gramEnd"/>
+      <w:r>
+        <w:t xml:space="preserve"> = -0.053 +/- 0.027 m/day. Notably, the dominant old-group coefficient was better identified than in the zoned case (its </w:t>
+      </w:r>
+      <w:proofErr w:type="spellStart"/>
+      <w:r>
+        <w:t>behavioural</w:t>
+      </w:r>
+      <w:proofErr w:type="spellEnd"/>
+      <w:r>
+        <w:t xml:space="preserve"> distribution narrowed to about 69% of the prior width, versus about 85% when the old pipes were concentrated), because old pipes now lie on the paths to several </w:t>
+      </w:r>
+      <w:proofErr w:type="gramStart"/>
+      <w:r>
+        <w:t>sensors</w:t>
+      </w:r>
+      <w:proofErr w:type="gramEnd"/>
+      <w:r>
+        <w:t xml:space="preserve"> so more observations carry information about it.</w:t>
       </w:r>
     </w:p>
     <w:p>
@@ -11012,12 +12372,34 @@
         <w:rPr>
           <w:i/>
         </w:rPr>
-        <w:t>Figure. GLUE-weighted behavioural distributions of the three grouped wall reaction coefficients under the interleaved pipe arrangement (prior range and true value shown).</w:t>
-      </w:r>
-    </w:p>
-    <w:p>
-      <w:r>
-        <w:t>The network-wide risk was correspondingly more dispersed: 46 of 92 junctions had a non-zero time-averaged below-threshold probability, compared with 25 of 92 in the zoned case, with high-risk nodes spread across the network rather than clustered in one region. These results show that the same calibration workflow yields different identifiability and risk patterns depending on the imposed pipe-group arrangement, including both the spatial distribution of reactive pipes and the number of pipes assigned to each reactivity class. This confirms that parameter identifiability depends not only on the numerical value of k_w, but also on whether the reactive pipes are hydraulically visible to the selected monitoring nodes.</w:t>
+        <w:t xml:space="preserve">Figure. GLUE-weighted </w:t>
+      </w:r>
+      <w:proofErr w:type="spellStart"/>
+      <w:r>
+        <w:rPr>
+          <w:i/>
+        </w:rPr>
+        <w:t>behavioural</w:t>
+      </w:r>
+      <w:proofErr w:type="spellEnd"/>
+      <w:r>
+        <w:rPr>
+          <w:i/>
+        </w:rPr>
+        <w:t xml:space="preserve"> distributions of the three grouped wall reaction coefficients under the interleaved pipe arrangement (prior range and true value shown).</w:t>
+      </w:r>
+    </w:p>
+    <w:p>
+      <w:r>
+        <w:t xml:space="preserve">The network-wide risk was correspondingly more dispersed: 46 of 92 junctions had a non-zero time-averaged below-threshold probability, compared with 25 of 92 in the zoned case, with high-risk nodes spread across the network rather than clustered in one region. These results show that the same calibration workflow yields different identifiability and risk patterns depending on the imposed pipe-group arrangement, including both the spatial distribution of reactive pipes and the number of pipes assigned to each reactivity class. This confirms that parameter identifiability depends not only on the numerical value of </w:t>
+      </w:r>
+      <w:proofErr w:type="spellStart"/>
+      <w:r>
+        <w:t>k_w</w:t>
+      </w:r>
+      <w:proofErr w:type="spellEnd"/>
+      <w:r>
+        <w:t>, but also on whether the reactive pipes are hydraulically visible to the selected monitoring nodes.</w:t>
       </w:r>
     </w:p>
     <w:p>
@@ -11074,7 +12456,21 @@
         <w:rPr>
           <w:i/>
         </w:rPr>
-        <w:t>Figure. GLUE-weighted network risk map under the interleaved arrangement, P(C &lt; 0.2 mg/L).</w:t>
+        <w:t xml:space="preserve">Figure. GLUE-weighted network risk map under the interleaved arrangement, </w:t>
+      </w:r>
+      <w:proofErr w:type="gramStart"/>
+      <w:r>
+        <w:rPr>
+          <w:i/>
+        </w:rPr>
+        <w:t>P(</w:t>
+      </w:r>
+      <w:proofErr w:type="gramEnd"/>
+      <w:r>
+        <w:rPr>
+          <w:i/>
+        </w:rPr>
+        <w:t>C &lt; 0.2 mg/L).</w:t>
       </w:r>
     </w:p>
     <w:p/>
@@ -11107,7 +12503,23 @@
     </w:p>
     <w:p>
       <w:r>
-        <w:t xml:space="preserve">The Net3 experiment shows that forward simulation, noisy synthetic monitoring, inverse recovery of grouped wall-decay coefficients, GLUE behavioural selection and network-wide threshold-risk mapping can be linked into one coherent workflow. The central contribution is that each stage passes an explicit representation of uncertainty to the next, rather than stopping at a single best-fitting decay vector. Whereas most reported wall-decay calibration studies conclude at a single best-fit coefficient set, the workflow demonstrated here retains and propagates the full behavioural ensemble, so </w:t>
+        <w:t xml:space="preserve">The Net3 experiment shows that forward simulation, noisy synthetic monitoring, inverse recovery of grouped wall-decay coefficients, GLUE </w:t>
+      </w:r>
+      <w:proofErr w:type="spellStart"/>
+      <w:r>
+        <w:t>behavioural</w:t>
+      </w:r>
+      <w:proofErr w:type="spellEnd"/>
+      <w:r>
+        <w:t xml:space="preserve"> selection and network-wide threshold-risk mapping can be linked into one coherent workflow. The central contribution is that each stage passes an explicit representation of uncertainty to the next, rather than stopping at a single best-fitting decay vector. Whereas most reported wall-decay calibration studies conclude at a single best-fit coefficient set, the workflow demonstrated here retains and propagates the full </w:t>
+      </w:r>
+      <w:proofErr w:type="spellStart"/>
+      <w:r>
+        <w:t>behavioural</w:t>
+      </w:r>
+      <w:proofErr w:type="spellEnd"/>
+      <w:r>
+        <w:t xml:space="preserve"> ensemble, so </w:t>
       </w:r>
       <w:r>
         <w:lastRenderedPageBreak/>
@@ -11128,13 +12540,37 @@
     </w:p>
     <w:p>
       <w:r>
-        <w:t>The most important interpretive result is that the three grouped wall-decay coefficients are not equally identifiable. The high-decay old group carries a clear signal but its behavioural distribution remains broad, while the low-decay new group is effectively unidentifiable because weak wall decay has little effect on residual concentration and therefore leaves almost no signature in the observations; its distribution width is close to its prior width. This is consistent with the ill-conditioned nature of the inverse problem described in the Background: with only six monitoring nodes, the observations do not contain enough independent information to constrain every group. This shows that identifiability is controlled not only by the magnitude of wall reactivity, but also by the hydraulic visibility of the reactive pipes to the selected monitoring nodes.</w:t>
-      </w:r>
-    </w:p>
-    <w:p/>
-    <w:p>
-      <w:r>
-        <w:t>A practical consequence is that increasing the number of pipe groups is not automatically beneficial. Adding groups increases the dimensionality of the inverse problem without necessarily adding information, so the extra parameters are simply left poorly constrained. The complexity of the wall-decay parameterisation should therefore be justified by the information content of the available monitoring data rather than by the level of detail in the pipe inventory. The interleaved scenario reinforces this point, but it should be read as a comparison of two pipe-group arrangements rather than an isolated spatial-redistribution test: the cyclic assignment changed both the spatial layout of the three coefficients and the number of pipes in each class (39/39/39 versus 14/37/66), and this joint change altered how well the dominant coefficient could be identified.</w:t>
+        <w:t xml:space="preserve">The most important interpretive result is that the three grouped wall-decay coefficients are not equally identifiable. The high-decay old group carries a clear </w:t>
+      </w:r>
+      <w:proofErr w:type="gramStart"/>
+      <w:r>
+        <w:t>signal</w:t>
+      </w:r>
+      <w:proofErr w:type="gramEnd"/>
+      <w:r>
+        <w:t xml:space="preserve"> but its </w:t>
+      </w:r>
+      <w:proofErr w:type="spellStart"/>
+      <w:r>
+        <w:t>behavioural</w:t>
+      </w:r>
+      <w:proofErr w:type="spellEnd"/>
+      <w:r>
+        <w:t xml:space="preserve"> distribution remains broad, while the low-decay new group is effectively unidentifiable because weak wall decay has little effect on residual concentration and therefore leaves almost no signature in the observations; its distribution width is close to its prior width. This is consistent with the ill-conditioned nature of the inverse problem described in the Background: with only six monitoring nodes, the observations do not contain enough independent information to constrain every group. This shows that identifiability is controlled not only by the magnitude of wall reactivity, but also by the hydraulic visibility of the reactive pipes to the selected monitoring nodes.</w:t>
+      </w:r>
+    </w:p>
+    <w:p/>
+    <w:p>
+      <w:r>
+        <w:t xml:space="preserve">A practical consequence is that increasing the number of pipe groups is not automatically beneficial. Adding groups increases the dimensionality of the inverse problem without necessarily adding information, so the extra parameters are simply left poorly constrained. The complexity of the wall-decay </w:t>
+      </w:r>
+      <w:proofErr w:type="spellStart"/>
+      <w:r>
+        <w:t>parameterisation</w:t>
+      </w:r>
+      <w:proofErr w:type="spellEnd"/>
+      <w:r>
+        <w:t xml:space="preserve"> should therefore be justified by the information content of the available monitoring data rather than by the level of detail in the pipe inventory. The interleaved scenario reinforces this point, but it should be read as a comparison of two pipe-group arrangements rather than an isolated spatial-redistribution test: the cyclic assignment changed both the spatial layout of the three coefficients and the number of pipes in each class (39/39/39 versus 14/37/66), and this joint change altered how well the dominant coefficient could be identified.</w:t>
       </w:r>
     </w:p>
     <w:p>
@@ -11152,7 +12588,23 @@
     <w:p>
       <w:r>
         <w:lastRenderedPageBreak/>
-        <w:t>Beyond parameter estimation, the network-wide risk map provides a risk-oriented output that is more directly interpretable than a single calibrated coefficient. Because it assigns every junction a GLUE-weighted probability of falling below the selected operational threshold, including unmonitored dead ends, it can be used to prioritise locations within the synthetic network. In this Net3 case, the high-probability old-pipe zone and distal dead ends would be the locations where further investigation, additional monitoring, or operational intervention would be considered first in a real-network application. The near-source new-zone nodes, by contrast, appear to be lower-priority under the assumptions of this synthetic experiment.</w:t>
+        <w:t xml:space="preserve">Beyond parameter estimation, the network-wide risk map provides a risk-oriented output that is more directly interpretable than a single calibrated coefficient. Because it assigns every junction a GLUE-weighted probability of falling below the selected operational threshold, including unmonitored dead ends, it can be used to </w:t>
+      </w:r>
+      <w:proofErr w:type="spellStart"/>
+      <w:r>
+        <w:t>prioritise</w:t>
+      </w:r>
+      <w:proofErr w:type="spellEnd"/>
+      <w:r>
+        <w:t xml:space="preserve"> locations within the synthetic network. In this Net3 case, the high-probability old-pipe zone and distal dead ends would be the locations </w:t>
+      </w:r>
+      <w:proofErr w:type="gramStart"/>
+      <w:r>
+        <w:t>where</w:t>
+      </w:r>
+      <w:proofErr w:type="gramEnd"/>
+      <w:r>
+        <w:t xml:space="preserve"> further investigation, additional monitoring, or operational intervention would be considered first in a real-network application. The near-source new-zone nodes, by contrast, appear to be lower-priority under the assumptions of this synthetic experiment.</w:t>
       </w:r>
     </w:p>
     <w:p>
@@ -11169,7 +12621,23 @@
     </w:p>
     <w:p>
       <w:r>
-        <w:t>Applying the workflow to real monitoring data will require several elements that the Net3 experiment idealised. The inlet chlorine boundary condition must be represented as a measured, time-varying series rather than a fixed value; the observation model must account for real sensor behaviour, including calibration drift, fouling, missing data and time-alignment error between sensors and the hydraulic simulation; the pipe grouping should be based on real material, age and DMA information; and the hydraulic model itself carries uncertainty in demands and connectivity. Measurements near the low-chlorine detection limit may also be censored. As stated in the Methodology, the present uncertainty model deliberately represents only random observation noise and excludes systematic bias, drift, time-alignment and hydraulic-representativeness errors; these must be added before the framework can be relied on for operational data. Future work could also explore censored likelihood formulations for observations near the detection limit and information-based sensor-placement criteria for selecting monitoring nodes that better constrain the risk-governing coefficients.</w:t>
+        <w:t xml:space="preserve">Applying the workflow to real monitoring data will require several elements that the Net3 experiment </w:t>
+      </w:r>
+      <w:proofErr w:type="spellStart"/>
+      <w:r>
+        <w:t>idealised</w:t>
+      </w:r>
+      <w:proofErr w:type="spellEnd"/>
+      <w:r>
+        <w:t xml:space="preserve">. The inlet chlorine boundary condition must be represented as a measured, time-varying series rather than a fixed value; the observation model must account for real sensor </w:t>
+      </w:r>
+      <w:proofErr w:type="spellStart"/>
+      <w:r>
+        <w:t>behaviour</w:t>
+      </w:r>
+      <w:proofErr w:type="spellEnd"/>
+      <w:r>
+        <w:t>, including calibration drift, fouling, missing data and time-alignment error between sensors and the hydraulic simulation; the pipe grouping should be based on real material, age and DMA information; and the hydraulic model itself carries uncertainty in demands and connectivity. Measurements near the low-chlorine detection limit may also be censored. As stated in the Methodology, the present uncertainty model deliberately represents only random observation noise and excludes systematic bias, drift, time-alignment and hydraulic-representativeness errors; these must be added before the framework can be relied on for operational data. Future work could also explore censored likelihood formulations for observations near the detection limit and information-based sensor-placement criteria for selecting monitoring nodes that better constrain the risk-governing coefficients.</w:t>
       </w:r>
     </w:p>
     <w:p>
@@ -11197,7 +12665,55 @@
       </w:r>
       <w:r>
         <w:lastRenderedPageBreak/>
-        <w:t>this prototype stage rather than as flaws. The most important is that the same model is used both to generate and to calibrate the observations, so the recovery results are optimistic and carry an element of inverse crime (Kaipio and Somersalo, 2005); a future study should break this by generating the synthetic observations with a different model, or a finer spatial and temporal discretisation, than the one used for calibration. Net3 is a benchmark network rather than a real utility system, and the hydraulic model is assumed correct, the source chlorine is fixed and simple, and demand uncertainty is ignored. The GLUE likelihood is an informal, scaled measure rather than a formal Bayesian posterior, and the behavioural threshold, prior ranges and sample size are subjective choices (Beven and Binley, 1992; Beven, 2006). The reported GLUE intervals and risk probabilities should therefore be interpreted as practical ensemble-based uncertainty measures rather than as formally calibrated Bayesian credible intervals or externally validated failure probabilities. The interleaved scenario also remains synthetic and should be interpreted as a sensitivity test rather than as an alternative representation of a real pipe inventory.</w:t>
+        <w:t>this prototype stage rather than as flaws. The most important is that the same model is used both to generate and to calibrate the observations, so the recovery results are optimistic and carry an element of inverse crime (</w:t>
+      </w:r>
+      <w:proofErr w:type="spellStart"/>
+      <w:r>
+        <w:t>Kaipio</w:t>
+      </w:r>
+      <w:proofErr w:type="spellEnd"/>
+      <w:r>
+        <w:t xml:space="preserve"> and </w:t>
+      </w:r>
+      <w:proofErr w:type="spellStart"/>
+      <w:r>
+        <w:t>Somersalo</w:t>
+      </w:r>
+      <w:proofErr w:type="spellEnd"/>
+      <w:r>
+        <w:t xml:space="preserve">, 2005); a future study should break this by generating the synthetic observations with a different model, or a finer spatial and temporal </w:t>
+      </w:r>
+      <w:proofErr w:type="spellStart"/>
+      <w:r>
+        <w:t>discretisation</w:t>
+      </w:r>
+      <w:proofErr w:type="spellEnd"/>
+      <w:r>
+        <w:t xml:space="preserve">, than the one used for calibration. Net3 is a benchmark network rather than a real utility system, and the hydraulic model is assumed correct, the source chlorine is fixed and simple, and demand uncertainty is ignored. The GLUE likelihood is an informal, scaled measure rather than a formal Bayesian posterior, and the </w:t>
+      </w:r>
+      <w:proofErr w:type="spellStart"/>
+      <w:r>
+        <w:t>behavioural</w:t>
+      </w:r>
+      <w:proofErr w:type="spellEnd"/>
+      <w:r>
+        <w:t xml:space="preserve"> threshold, prior ranges and sample size are subjective choices (</w:t>
+      </w:r>
+      <w:proofErr w:type="spellStart"/>
+      <w:r>
+        <w:t>Beven</w:t>
+      </w:r>
+      <w:proofErr w:type="spellEnd"/>
+      <w:r>
+        <w:t xml:space="preserve"> and Binley, 1992; </w:t>
+      </w:r>
+      <w:proofErr w:type="spellStart"/>
+      <w:r>
+        <w:t>Beven</w:t>
+      </w:r>
+      <w:proofErr w:type="spellEnd"/>
+      <w:r>
+        <w:t>, 2006). The reported GLUE intervals and risk probabilities should therefore be interpreted as practical ensemble-based uncertainty measures rather than as formally calibrated Bayesian credible intervals or externally validated failure probabilities. The interleaved scenario also remains synthetic and should be interpreted as a sensitivity test rather than as an alternative representation of a real pipe inventory.</w:t>
       </w:r>
     </w:p>
     <w:p>
@@ -11258,8 +12774,21 @@
       </w:r>
     </w:p>
     <w:p>
-      <w:r>
-        <w:t xml:space="preserve">Aisopou, A. and Stoianov, I. (2024) ‘Evaluation of free-chlorine data from online sensors in a water supply network’, </w:t>
+      <w:proofErr w:type="spellStart"/>
+      <w:r>
+        <w:t>Aisopou</w:t>
+      </w:r>
+      <w:proofErr w:type="spellEnd"/>
+      <w:r>
+        <w:t xml:space="preserve">, A. and </w:t>
+      </w:r>
+      <w:proofErr w:type="spellStart"/>
+      <w:r>
+        <w:t>Stoianov</w:t>
+      </w:r>
+      <w:proofErr w:type="spellEnd"/>
+      <w:r>
+        <w:t xml:space="preserve">, I. (2024) ‘Evaluation of free-chlorine data from online sensors in a water supply network’, </w:t>
       </w:r>
       <w:r>
         <w:rPr>
@@ -11283,23 +12812,49 @@
     <w:p/>
     <w:p>
       <w:r>
-        <w:t>Aster, R.C., Borchers, B. and Thurber, C.H. (2018) Parameter Estimation and Inverse Problems. 3rd edn. Amsterdam: Elsevier.</w:t>
-      </w:r>
-    </w:p>
-    <w:p/>
-    <w:p>
-      <w:r>
-        <w:t>Beven, K. and Binley, A. (1992) ‘The future of distributed models: model calibration and uncertainty prediction’, Hydrological Processes, 6(3), pp. 279–298. https://doi.org/10.1002/hyp.3360060305</w:t>
-      </w:r>
-    </w:p>
-    <w:p>
-      <w:r>
-        <w:t>Beven, K.J. (2006) ‘A manifesto for the equifinality thesis’, Journal of Hydrology, 320(1–2), pp. 18–36. https://doi.org/10.1016/j.jhydrol.2005.07.007</w:t>
-      </w:r>
-    </w:p>
-    <w:p>
-      <w:r>
-        <w:t xml:space="preserve">Fisher, I., Kastl, G. and Sathasivan, A. (2017) ‘New model of chlorine-wall reaction for simulating chlorine concentration in drinking water distribution systems’, </w:t>
+        <w:t xml:space="preserve">Aster, R.C., Borchers, B. and Thurber, C.H. (2018) Parameter Estimation and Inverse Problems. 3rd </w:t>
+      </w:r>
+      <w:proofErr w:type="spellStart"/>
+      <w:r>
+        <w:t>edn</w:t>
+      </w:r>
+      <w:proofErr w:type="spellEnd"/>
+      <w:r>
+        <w:t>. Amsterdam: Elsevier.</w:t>
+      </w:r>
+    </w:p>
+    <w:p/>
+    <w:p>
+      <w:proofErr w:type="spellStart"/>
+      <w:r>
+        <w:t>Beven</w:t>
+      </w:r>
+      <w:proofErr w:type="spellEnd"/>
+      <w:r>
+        <w:t>, K. and Binley, A. (1992) ‘The future of distributed models: model calibration and uncertainty prediction’, Hydrological Processes, 6(3), pp. 279–298. https://doi.org/10.1002/hyp.3360060305</w:t>
+      </w:r>
+    </w:p>
+    <w:p>
+      <w:proofErr w:type="spellStart"/>
+      <w:r>
+        <w:t>Beven</w:t>
+      </w:r>
+      <w:proofErr w:type="spellEnd"/>
+      <w:r>
+        <w:t>, K.J. (2006) ‘A manifesto for the equifinality thesis’, Journal of Hydrology, 320(1–2), pp. 18–36. https://doi.org/10.1016/j.jhydrol.2005.07.007</w:t>
+      </w:r>
+    </w:p>
+    <w:p>
+      <w:r>
+        <w:t xml:space="preserve">Fisher, I., Kastl, G. and </w:t>
+      </w:r>
+      <w:proofErr w:type="spellStart"/>
+      <w:r>
+        <w:t>Sathasivan</w:t>
+      </w:r>
+      <w:proofErr w:type="spellEnd"/>
+      <w:r>
+        <w:t xml:space="preserve">, A. (2017) ‘New model of chlorine-wall reaction for simulating chlorine concentration in drinking water distribution systems’, </w:t>
       </w:r>
       <w:r>
         <w:rPr>
@@ -11334,28 +12889,72 @@
     </w:p>
     <w:p/>
     <w:p>
-      <w:r>
-        <w:t>Kaipio, J.P. and Somersalo, E. (2005) Statistical and Computational Inverse Problems. New York, NY: Springer. https://doi.org/10.1007/b138659</w:t>
-      </w:r>
-    </w:p>
-    <w:p>
-      <w:r>
-        <w:t xml:space="preserve">Kazma, M.H., Elsherif, S.M. and Taha, A.F. (2024) ‘Observability and generalized </w:t>
+      <w:proofErr w:type="spellStart"/>
+      <w:r>
+        <w:t>Kaipio</w:t>
+      </w:r>
+      <w:proofErr w:type="spellEnd"/>
+      <w:r>
+        <w:t xml:space="preserve">, J.P. and </w:t>
+      </w:r>
+      <w:proofErr w:type="spellStart"/>
+      <w:r>
+        <w:t>Somersalo</w:t>
+      </w:r>
+      <w:proofErr w:type="spellEnd"/>
+      <w:r>
+        <w:t>, E. (2005) Statistical and Computational Inverse Problems. New York, NY: Springer. https://doi.org/10.1007/b138659</w:t>
+      </w:r>
+    </w:p>
+    <w:p>
+      <w:proofErr w:type="spellStart"/>
+      <w:r>
+        <w:t>Kazma</w:t>
+      </w:r>
+      <w:proofErr w:type="spellEnd"/>
+      <w:r>
+        <w:t xml:space="preserve">, M.H., </w:t>
+      </w:r>
+      <w:proofErr w:type="spellStart"/>
+      <w:r>
+        <w:t>Elsherif</w:t>
+      </w:r>
+      <w:proofErr w:type="spellEnd"/>
+      <w:r>
+        <w:t xml:space="preserve">, S.M. and Taha, A.F. (2024) ‘Observability and generalized </w:t>
       </w:r>
       <w:r>
         <w:lastRenderedPageBreak/>
-        <w:t>sensor placement for nonlinear quality models in drinking water networks’. Available at: arXiv:2411.04202.</w:t>
-      </w:r>
-    </w:p>
-    <w:p/>
-    <w:p>
-      <w:r>
-        <w:t>Klise, K.A., Bynum, M., Moriarty, D. and Murray, R. (2017) ‘A software framework for assessing the resilience of drinking water systems to disasters with an example earthquake case study’, Environmental Modelling &amp; Software, 95, pp. 420–431. https://doi.org/10.1016/j.envsoft.2017.06.022</w:t>
-      </w:r>
-    </w:p>
-    <w:p>
-      <w:r>
-        <w:t>LeChevallier, M.W., Welch, N.J. and Smith, D.B. (1996) ‘Full-scale studies of factors related to coliform regrowth in drinking water’, Applied and Environmental Microbiology, 62(7), pp. 2201-2211.</w:t>
+        <w:t xml:space="preserve">sensor placement for nonlinear quality models in drinking water </w:t>
+      </w:r>
+      <w:proofErr w:type="gramStart"/>
+      <w:r>
+        <w:t>networks’</w:t>
+      </w:r>
+      <w:proofErr w:type="gramEnd"/>
+      <w:r>
+        <w:t>. Available at: arXiv:2411.04202.</w:t>
+      </w:r>
+    </w:p>
+    <w:p/>
+    <w:p>
+      <w:proofErr w:type="spellStart"/>
+      <w:r>
+        <w:t>Klise</w:t>
+      </w:r>
+      <w:proofErr w:type="spellEnd"/>
+      <w:r>
+        <w:t>, K.A., Bynum, M., Moriarty, D. and Murray, R. (2017) ‘A software framework for assessing the resilience of drinking water systems to disasters with an example earthquake case study’, Environmental Modelling &amp; Software, 95, pp. 420–431. https://doi.org/10.1016/j.envsoft.2017.06.022</w:t>
+      </w:r>
+    </w:p>
+    <w:p>
+      <w:proofErr w:type="spellStart"/>
+      <w:r>
+        <w:t>LeChevallier</w:t>
+      </w:r>
+      <w:proofErr w:type="spellEnd"/>
+      <w:r>
+        <w:t>, M.W., Welch, N.J. and Smith, D.B. (1996) ‘Full-scale studies of factors related to coliform regrowth in drinking water’, Applied and Environmental Microbiology, 62(7), pp. 2201-2211.</w:t>
       </w:r>
     </w:p>
     <w:p/>
@@ -11384,8 +12983,29 @@
     </w:p>
     <w:p/>
     <w:p>
-      <w:r>
-        <w:t xml:space="preserve">Nejjari, F., Puig, V., Pérez, R., Quevedo, J., Cugueró, M.A., Sanz, G. and Mirats, J.M. (2014) ‘Chlorine decay model calibration and comparison: Application to a real water network’, </w:t>
+      <w:proofErr w:type="spellStart"/>
+      <w:r>
+        <w:t>Nejjari</w:t>
+      </w:r>
+      <w:proofErr w:type="spellEnd"/>
+      <w:r>
+        <w:t xml:space="preserve">, F., Puig, V., Pérez, R., Quevedo, J., </w:t>
+      </w:r>
+      <w:proofErr w:type="spellStart"/>
+      <w:r>
+        <w:t>Cugueró</w:t>
+      </w:r>
+      <w:proofErr w:type="spellEnd"/>
+      <w:r>
+        <w:t xml:space="preserve">, M.A., Sanz, G. and </w:t>
+      </w:r>
+      <w:proofErr w:type="spellStart"/>
+      <w:r>
+        <w:t>Mirats</w:t>
+      </w:r>
+      <w:proofErr w:type="spellEnd"/>
+      <w:r>
+        <w:t xml:space="preserve">, J.M. (2014) ‘Chlorine decay model calibration and comparison: Application to a real water network’, </w:t>
       </w:r>
       <w:r>
         <w:rPr>
@@ -11409,13 +13029,29 @@
     <w:p/>
     <w:p>
       <w:r>
-        <w:t>Rossman, L.A. (2000) EPANET 2 Users Manual. Cincinnati, OH: U.S. Environmental Protection Agency.</w:t>
-      </w:r>
-    </w:p>
-    <w:p/>
-    <w:p>
-      <w:r>
-        <w:t>Rossman, L.A., Woo, H., Tryby, M., Shang, F., Janke, R. and Haxton, T. (2020) EPANET 2.2 User Manual. Cincinnati, OH: U.S. Environmental Protection Agency.</w:t>
+        <w:t xml:space="preserve">Rossman, L.A. (2000) EPANET 2 </w:t>
+      </w:r>
+      <w:proofErr w:type="spellStart"/>
+      <w:r>
+        <w:t>Users Manual</w:t>
+      </w:r>
+      <w:proofErr w:type="spellEnd"/>
+      <w:r>
+        <w:t>. Cincinnati, OH: U.S. Environmental Protection Agency.</w:t>
+      </w:r>
+    </w:p>
+    <w:p/>
+    <w:p>
+      <w:r>
+        <w:t xml:space="preserve">Rossman, L.A., Woo, H., </w:t>
+      </w:r>
+      <w:proofErr w:type="spellStart"/>
+      <w:r>
+        <w:t>Tryby</w:t>
+      </w:r>
+      <w:proofErr w:type="spellEnd"/>
+      <w:r>
+        <w:t>, M., Shang, F., Janke, R. and Haxton, T. (2020) EPANET 2.2 User Manual. Cincinnati, OH: U.S. Environmental Protection Agency.</w:t>
       </w:r>
     </w:p>
     <w:p/>
@@ -11428,7 +13064,15 @@
     <w:p>
       <w:r>
         <w:lastRenderedPageBreak/>
-        <w:t>Rossman, L.A., Clark, R.M. and Grayman, W.M. (1994) ‘Modeling chlorine residuals in drinking-water distribution systems’, Journal of Environmental Engineering, 120(4), pp. 803-820.</w:t>
+        <w:t xml:space="preserve">Rossman, L.A., Clark, R.M. and </w:t>
+      </w:r>
+      <w:proofErr w:type="spellStart"/>
+      <w:r>
+        <w:t>Grayman</w:t>
+      </w:r>
+      <w:proofErr w:type="spellEnd"/>
+      <w:r>
+        <w:t>, W.M. (1994) ‘Modeling chlorine residuals in drinking-water distribution systems’, Journal of Environmental Engineering, 120(4), pp. 803-820.</w:t>
       </w:r>
     </w:p>
     <w:p/>
@@ -11440,7 +13084,39 @@
     <w:p/>
     <w:p>
       <w:r>
-        <w:t>Taha, A.F., Wang, S., Guo, Y., Summers, T.H., Gatsis, N., Giacomoni, M.H. and Abokifa, A. (2020) ‘Revisiting the water quality sensor placement problem: Optimizing network observability and state estimation metrics’. Available at: arXiv:2012.05268.</w:t>
+        <w:t xml:space="preserve">Taha, A.F., Wang, S., Guo, Y., Summers, T.H., </w:t>
+      </w:r>
+      <w:proofErr w:type="spellStart"/>
+      <w:r>
+        <w:t>Gatsis</w:t>
+      </w:r>
+      <w:proofErr w:type="spellEnd"/>
+      <w:r>
+        <w:t xml:space="preserve">, N., </w:t>
+      </w:r>
+      <w:proofErr w:type="spellStart"/>
+      <w:r>
+        <w:t>Giacomoni</w:t>
+      </w:r>
+      <w:proofErr w:type="spellEnd"/>
+      <w:r>
+        <w:t xml:space="preserve">, M.H. and </w:t>
+      </w:r>
+      <w:proofErr w:type="spellStart"/>
+      <w:r>
+        <w:t>Abokifa</w:t>
+      </w:r>
+      <w:proofErr w:type="spellEnd"/>
+      <w:r>
+        <w:t xml:space="preserve">, A. (2020) ‘Revisiting the water quality sensor placement problem: Optimizing network observability and state estimation </w:t>
+      </w:r>
+      <w:proofErr w:type="gramStart"/>
+      <w:r>
+        <w:t>metrics’</w:t>
+      </w:r>
+      <w:proofErr w:type="gramEnd"/>
+      <w:r>
+        <w:t>. Available at: arXiv:2012.05268.</w:t>
       </w:r>
     </w:p>
     <w:p/>
@@ -11468,13 +13144,29 @@
     <w:p/>
     <w:p>
       <w:r>
-        <w:t>Vasconcelos, J.J., Rossman, L.A., Grayman, W.M., Boulos, P.F. and Clark, R.M. (1997) ‘Kinetics of chlorine decay’, Journal AWWA, 89(7), pp. 54-65.</w:t>
-      </w:r>
-    </w:p>
-    <w:p/>
-    <w:p>
-      <w:r>
-        <w:t>Wang, S., Chakrabarty, A. and Taha, A.F. (2022) ‘Data-driven identification of dynamic quality models in drinking water networks’. Available at: arXiv:2207.05983.</w:t>
+        <w:t xml:space="preserve">Vasconcelos, J.J., Rossman, L.A., </w:t>
+      </w:r>
+      <w:proofErr w:type="spellStart"/>
+      <w:r>
+        <w:t>Grayman</w:t>
+      </w:r>
+      <w:proofErr w:type="spellEnd"/>
+      <w:r>
+        <w:t>, W.M., Boulos, P.F. and Clark, R.M. (1997) ‘Kinetics of chlorine decay’, Journal AWWA, 89(7), pp. 54-65.</w:t>
+      </w:r>
+    </w:p>
+    <w:p/>
+    <w:p>
+      <w:r>
+        <w:t xml:space="preserve">Wang, S., Chakrabarty, A. and Taha, A.F. (2022) ‘Data-driven identification of dynamic quality models in drinking water </w:t>
+      </w:r>
+      <w:proofErr w:type="gramStart"/>
+      <w:r>
+        <w:t>networks’</w:t>
+      </w:r>
+      <w:proofErr w:type="gramEnd"/>
+      <w:r>
+        <w:t>. Available at: arXiv:2207.05983.</w:t>
       </w:r>
     </w:p>
     <w:p/>

</xml_diff>